<commit_message>
[REPORT] Aggiunte informazioni al report
Aggiunte informazioni generali, motivate scelte degli ADT, descritta progettazione e architettura, e descritto come utilizzare il sistema
</commit_message>
<xml_diff>
--- a/Relazione_Progetto.docx
+++ b/Relazione_Progetto.docx
@@ -232,23 +232,35 @@
           <w:sz w:val="24"/>
           <w:szCs w:val="24"/>
         </w:rPr>
-        <w:t xml:space="preserve">Il contesto di riferimento è quello del </w:t>
-      </w:r>
-      <w:r>
-        <w:rPr>
-          <w:i/>
-          <w:iCs/>
-          <w:sz w:val="24"/>
-          <w:szCs w:val="24"/>
-        </w:rPr>
-        <w:t>facility management</w:t>
-      </w:r>
-      <w:r>
-        <w:rPr>
-          <w:sz w:val="24"/>
-          <w:szCs w:val="24"/>
-        </w:rPr>
-        <w:t xml:space="preserve"> condominiale.</w:t>
+        <w:t>Il contesto di riferimento è quello del</w:t>
+      </w:r>
+      <w:r>
+        <w:rPr>
+          <w:sz w:val="24"/>
+          <w:szCs w:val="24"/>
+        </w:rPr>
+        <w:t>la gestione di</w:t>
+      </w:r>
+      <w:r>
+        <w:rPr>
+          <w:sz w:val="24"/>
+          <w:szCs w:val="24"/>
+        </w:rPr>
+        <w:t xml:space="preserve"> </w:t>
+      </w:r>
+      <w:r>
+        <w:rPr>
+          <w:sz w:val="24"/>
+          <w:szCs w:val="24"/>
+        </w:rPr>
+        <w:t>un condominio</w:t>
+      </w:r>
+      <w:r>
+        <w:rPr>
+          <w:sz w:val="24"/>
+          <w:szCs w:val="24"/>
+        </w:rPr>
+        <w:t>.</w:t>
       </w:r>
       <w:r>
         <w:rPr>
@@ -626,6 +638,2579 @@
         </w:pBdr>
         <w:spacing w:line="360" w:lineRule="auto"/>
         <w:jc w:val="both"/>
+        <w:rPr>
+          <w:sz w:val="24"/>
+          <w:szCs w:val="24"/>
+        </w:rPr>
+      </w:pPr>
+      <w:r>
+        <w:rPr>
+          <w:sz w:val="24"/>
+          <w:szCs w:val="24"/>
+        </w:rPr>
+        <w:t xml:space="preserve">L'architettura del sistema è stata progettata seguendo i principi dell'Information </w:t>
+      </w:r>
+      <w:proofErr w:type="spellStart"/>
+      <w:r>
+        <w:rPr>
+          <w:sz w:val="24"/>
+          <w:szCs w:val="24"/>
+        </w:rPr>
+        <w:t>Hiding</w:t>
+      </w:r>
+      <w:proofErr w:type="spellEnd"/>
+      <w:r>
+        <w:rPr>
+          <w:sz w:val="24"/>
+          <w:szCs w:val="24"/>
+        </w:rPr>
+        <w:t xml:space="preserve"> e della modularità. Ogni entità logica del dominio è gestita da una specifica Struttura Dati Astratta (ADT), selezionata per ottimizzare il bilanciamento tra complessità spaziale (occupazione di memoria) e complessità temporale (efficienza degli algoritmi), rispondendo in modo preciso ai requisiti di sistema.</w:t>
+      </w:r>
+    </w:p>
+    <w:p>
+      <w:pPr>
+        <w:pBdr>
+          <w:top w:val="nil"/>
+          <w:left w:val="nil"/>
+          <w:bottom w:val="nil"/>
+          <w:right w:val="nil"/>
+          <w:between w:val="nil"/>
+        </w:pBdr>
+        <w:spacing w:line="360" w:lineRule="auto"/>
+        <w:jc w:val="both"/>
+        <w:rPr>
+          <w:sz w:val="24"/>
+          <w:szCs w:val="24"/>
+        </w:rPr>
+      </w:pPr>
+      <w:r>
+        <w:rPr>
+          <w:sz w:val="24"/>
+          <w:szCs w:val="24"/>
+        </w:rPr>
+        <w:t>Di seguito vengono analizzati gli ADT principali e le motivazioni algoritmiche alla base della loro scelta.</w:t>
+      </w:r>
+    </w:p>
+    <w:p>
+      <w:pPr>
+        <w:pBdr>
+          <w:top w:val="nil"/>
+          <w:left w:val="nil"/>
+          <w:bottom w:val="nil"/>
+          <w:right w:val="nil"/>
+          <w:between w:val="nil"/>
+        </w:pBdr>
+        <w:spacing w:line="360" w:lineRule="auto"/>
+        <w:jc w:val="both"/>
+        <w:rPr>
+          <w:b/>
+          <w:bCs/>
+          <w:sz w:val="24"/>
+          <w:szCs w:val="24"/>
+        </w:rPr>
+      </w:pPr>
+      <w:r>
+        <w:rPr>
+          <w:b/>
+          <w:bCs/>
+          <w:sz w:val="24"/>
+          <w:szCs w:val="24"/>
+        </w:rPr>
+        <w:t>1. Archivio Richieste (Archivio Globale)</w:t>
+      </w:r>
+    </w:p>
+    <w:p>
+      <w:pPr>
+        <w:numPr>
+          <w:ilvl w:val="0"/>
+          <w:numId w:val="7"/>
+        </w:numPr>
+        <w:pBdr>
+          <w:top w:val="nil"/>
+          <w:left w:val="nil"/>
+          <w:bottom w:val="nil"/>
+          <w:right w:val="nil"/>
+          <w:between w:val="nil"/>
+        </w:pBdr>
+        <w:spacing w:line="360" w:lineRule="auto"/>
+        <w:jc w:val="both"/>
+        <w:rPr>
+          <w:sz w:val="24"/>
+          <w:szCs w:val="24"/>
+        </w:rPr>
+      </w:pPr>
+      <w:r>
+        <w:rPr>
+          <w:b/>
+          <w:bCs/>
+          <w:sz w:val="24"/>
+          <w:szCs w:val="24"/>
+        </w:rPr>
+        <w:t>Struttura Dati Implementata:</w:t>
+      </w:r>
+      <w:r>
+        <w:rPr>
+          <w:sz w:val="24"/>
+          <w:szCs w:val="24"/>
+        </w:rPr>
+        <w:t xml:space="preserve"> Lista Concatenata (dinamica).</w:t>
+      </w:r>
+    </w:p>
+    <w:p>
+      <w:pPr>
+        <w:numPr>
+          <w:ilvl w:val="0"/>
+          <w:numId w:val="7"/>
+        </w:numPr>
+        <w:pBdr>
+          <w:top w:val="nil"/>
+          <w:left w:val="nil"/>
+          <w:bottom w:val="nil"/>
+          <w:right w:val="nil"/>
+          <w:between w:val="nil"/>
+        </w:pBdr>
+        <w:spacing w:line="360" w:lineRule="auto"/>
+        <w:jc w:val="both"/>
+        <w:rPr>
+          <w:sz w:val="24"/>
+          <w:szCs w:val="24"/>
+        </w:rPr>
+      </w:pPr>
+      <w:r>
+        <w:rPr>
+          <w:b/>
+          <w:bCs/>
+          <w:sz w:val="24"/>
+          <w:szCs w:val="24"/>
+        </w:rPr>
+        <w:t>Ruolo nel Sistema:</w:t>
+      </w:r>
+      <w:r>
+        <w:rPr>
+          <w:sz w:val="24"/>
+          <w:szCs w:val="24"/>
+        </w:rPr>
+        <w:t xml:space="preserve"> Conservare l'intero storico delle segnalazioni, indipendentemente dal loro stato (aperte, concluse, annullate).</w:t>
+      </w:r>
+    </w:p>
+    <w:p>
+      <w:pPr>
+        <w:numPr>
+          <w:ilvl w:val="0"/>
+          <w:numId w:val="7"/>
+        </w:numPr>
+        <w:pBdr>
+          <w:top w:val="nil"/>
+          <w:left w:val="nil"/>
+          <w:bottom w:val="nil"/>
+          <w:right w:val="nil"/>
+          <w:between w:val="nil"/>
+        </w:pBdr>
+        <w:spacing w:line="360" w:lineRule="auto"/>
+        <w:jc w:val="both"/>
+        <w:rPr>
+          <w:sz w:val="24"/>
+          <w:szCs w:val="24"/>
+        </w:rPr>
+      </w:pPr>
+      <w:r>
+        <w:rPr>
+          <w:b/>
+          <w:bCs/>
+          <w:sz w:val="24"/>
+          <w:szCs w:val="24"/>
+        </w:rPr>
+        <w:t>Motivazione della Scelta:</w:t>
+      </w:r>
+      <w:r>
+        <w:rPr>
+          <w:sz w:val="24"/>
+          <w:szCs w:val="24"/>
+        </w:rPr>
+        <w:t xml:space="preserve"> Il requisito impone la registrazione continua di nuove richieste di intervento e la necessità di produrre report o applicare filtri di ricerca su grandi volumi di dati. Poiché il numero totale di segnalazioni nel ciclo di vita del condominio non è predicibile a priori, una struttura ad allocazione dinamica sequenziale risulta ideale. La lista concatenata garantisce un costo di inserimento in coda costante (</w:t>
+      </w:r>
+      <w:proofErr w:type="gramStart"/>
+      <w:r>
+        <w:rPr>
+          <w:sz w:val="24"/>
+          <w:szCs w:val="24"/>
+        </w:rPr>
+        <w:t>O(</w:t>
+      </w:r>
+      <w:proofErr w:type="gramEnd"/>
+      <w:r>
+        <w:rPr>
+          <w:sz w:val="24"/>
+          <w:szCs w:val="24"/>
+        </w:rPr>
+        <w:t>1)). Inoltre, poiché le operazioni di reportistica (es. calcolo dei tempi medi, filtro per stato o tipologia) richiedono fisiologicamente una scansione completa del dataset, l'assenza di accesso casuale diretto (O(n)</w:t>
+      </w:r>
+      <w:r>
+        <w:rPr>
+          <w:sz w:val="24"/>
+          <w:szCs w:val="24"/>
+        </w:rPr>
+        <w:t xml:space="preserve"> </w:t>
+      </w:r>
+      <w:r>
+        <w:rPr>
+          <w:sz w:val="24"/>
+          <w:szCs w:val="24"/>
+        </w:rPr>
+        <w:t>per la ricerca) non costituisce un collo di bottiglia, rendendo la lista la soluzione più leggera e flessibile dal punto di vista della gestione della memoria heap.</w:t>
+      </w:r>
+    </w:p>
+    <w:p>
+      <w:pPr>
+        <w:pBdr>
+          <w:top w:val="nil"/>
+          <w:left w:val="nil"/>
+          <w:bottom w:val="nil"/>
+          <w:right w:val="nil"/>
+          <w:between w:val="nil"/>
+        </w:pBdr>
+        <w:spacing w:line="360" w:lineRule="auto"/>
+        <w:jc w:val="both"/>
+        <w:rPr>
+          <w:b/>
+          <w:bCs/>
+          <w:sz w:val="24"/>
+          <w:szCs w:val="24"/>
+        </w:rPr>
+      </w:pPr>
+      <w:r>
+        <w:rPr>
+          <w:b/>
+          <w:bCs/>
+          <w:sz w:val="24"/>
+          <w:szCs w:val="24"/>
+        </w:rPr>
+        <w:t>2. Coda di Attesa / Assegnazioni (Gestore Priorità)</w:t>
+      </w:r>
+    </w:p>
+    <w:p>
+      <w:pPr>
+        <w:numPr>
+          <w:ilvl w:val="0"/>
+          <w:numId w:val="8"/>
+        </w:numPr>
+        <w:pBdr>
+          <w:top w:val="nil"/>
+          <w:left w:val="nil"/>
+          <w:bottom w:val="nil"/>
+          <w:right w:val="nil"/>
+          <w:between w:val="nil"/>
+        </w:pBdr>
+        <w:spacing w:line="360" w:lineRule="auto"/>
+        <w:jc w:val="both"/>
+        <w:rPr>
+          <w:sz w:val="24"/>
+          <w:szCs w:val="24"/>
+        </w:rPr>
+      </w:pPr>
+      <w:r>
+        <w:rPr>
+          <w:b/>
+          <w:bCs/>
+          <w:sz w:val="24"/>
+          <w:szCs w:val="24"/>
+        </w:rPr>
+        <w:t>Struttura Dati Implementata:</w:t>
+      </w:r>
+      <w:r>
+        <w:rPr>
+          <w:sz w:val="24"/>
+          <w:szCs w:val="24"/>
+        </w:rPr>
+        <w:t xml:space="preserve"> Max-Heap (basato su Array Dinamico).</w:t>
+      </w:r>
+    </w:p>
+    <w:p>
+      <w:pPr>
+        <w:numPr>
+          <w:ilvl w:val="0"/>
+          <w:numId w:val="8"/>
+        </w:numPr>
+        <w:pBdr>
+          <w:top w:val="nil"/>
+          <w:left w:val="nil"/>
+          <w:bottom w:val="nil"/>
+          <w:right w:val="nil"/>
+          <w:between w:val="nil"/>
+        </w:pBdr>
+        <w:spacing w:line="360" w:lineRule="auto"/>
+        <w:jc w:val="both"/>
+        <w:rPr>
+          <w:sz w:val="24"/>
+          <w:szCs w:val="24"/>
+        </w:rPr>
+      </w:pPr>
+      <w:r>
+        <w:rPr>
+          <w:b/>
+          <w:bCs/>
+          <w:sz w:val="24"/>
+          <w:szCs w:val="24"/>
+        </w:rPr>
+        <w:t>Ruolo nel Sistema:</w:t>
+      </w:r>
+      <w:r>
+        <w:rPr>
+          <w:sz w:val="24"/>
+          <w:szCs w:val="24"/>
+        </w:rPr>
+        <w:t xml:space="preserve"> Gestire le richieste nello stato "APERTA" in attesa di essere assegnate a un tecnico.</w:t>
+      </w:r>
+    </w:p>
+    <w:p>
+      <w:pPr>
+        <w:numPr>
+          <w:ilvl w:val="0"/>
+          <w:numId w:val="8"/>
+        </w:numPr>
+        <w:pBdr>
+          <w:top w:val="nil"/>
+          <w:left w:val="nil"/>
+          <w:bottom w:val="nil"/>
+          <w:right w:val="nil"/>
+          <w:between w:val="nil"/>
+        </w:pBdr>
+        <w:spacing w:line="360" w:lineRule="auto"/>
+        <w:jc w:val="both"/>
+        <w:rPr>
+          <w:sz w:val="24"/>
+          <w:szCs w:val="24"/>
+        </w:rPr>
+      </w:pPr>
+      <w:r>
+        <w:rPr>
+          <w:b/>
+          <w:bCs/>
+          <w:sz w:val="24"/>
+          <w:szCs w:val="24"/>
+        </w:rPr>
+        <w:t>Motivazione della Scelta:</w:t>
+      </w:r>
+    </w:p>
+    <w:p>
+      <w:pPr>
+        <w:pBdr>
+          <w:top w:val="nil"/>
+          <w:left w:val="nil"/>
+          <w:bottom w:val="nil"/>
+          <w:right w:val="nil"/>
+          <w:between w:val="nil"/>
+        </w:pBdr>
+        <w:spacing w:line="360" w:lineRule="auto"/>
+        <w:jc w:val="both"/>
+        <w:rPr>
+          <w:sz w:val="24"/>
+          <w:szCs w:val="24"/>
+        </w:rPr>
+      </w:pPr>
+      <w:r>
+        <w:rPr>
+          <w:sz w:val="24"/>
+          <w:szCs w:val="24"/>
+        </w:rPr>
+        <w:t xml:space="preserve">Il sistema deve supportare la "gestione della priorità" e garantire che le emergenze vengano trattate prima dei guasti ordinari. L'implementazione di un Max-Heap in cui la </w:t>
+      </w:r>
+      <w:r>
+        <w:rPr>
+          <w:sz w:val="24"/>
+          <w:szCs w:val="24"/>
+        </w:rPr>
+        <w:lastRenderedPageBreak/>
+        <w:t>chiave di confronto è il "livello di urgenza" assicura che il recupero del ticket più critico avvenga sempre con un costo temporale costante (</w:t>
+      </w:r>
+      <w:proofErr w:type="gramStart"/>
+      <w:r>
+        <w:rPr>
+          <w:sz w:val="24"/>
+          <w:szCs w:val="24"/>
+        </w:rPr>
+        <w:t>O(</w:t>
+      </w:r>
+      <w:proofErr w:type="gramEnd"/>
+      <w:r>
+        <w:rPr>
+          <w:sz w:val="24"/>
+          <w:szCs w:val="24"/>
+        </w:rPr>
+        <w:t xml:space="preserve">1) per la lettura, </w:t>
+      </w:r>
+      <w:proofErr w:type="gramStart"/>
+      <w:r>
+        <w:rPr>
+          <w:sz w:val="24"/>
+          <w:szCs w:val="24"/>
+        </w:rPr>
+        <w:t>O(</w:t>
+      </w:r>
+      <w:proofErr w:type="gramEnd"/>
+      <w:r>
+        <w:rPr>
+          <w:sz w:val="24"/>
+          <w:szCs w:val="24"/>
+        </w:rPr>
+        <w:t>log n) per l'estrazione). Per la rimozione di elementi assegnati o annullati, l'implementazione può avvalersi di flag di validità logica, evitando continue riallocazioni dell'array e mantenendo altissime prestazioni.</w:t>
+      </w:r>
+    </w:p>
+    <w:p>
+      <w:pPr>
+        <w:pBdr>
+          <w:top w:val="nil"/>
+          <w:left w:val="nil"/>
+          <w:bottom w:val="nil"/>
+          <w:right w:val="nil"/>
+          <w:between w:val="nil"/>
+        </w:pBdr>
+        <w:spacing w:line="360" w:lineRule="auto"/>
+        <w:jc w:val="both"/>
+        <w:rPr>
+          <w:b/>
+          <w:bCs/>
+          <w:sz w:val="24"/>
+          <w:szCs w:val="24"/>
+        </w:rPr>
+      </w:pPr>
+      <w:r>
+        <w:rPr>
+          <w:b/>
+          <w:bCs/>
+          <w:sz w:val="24"/>
+          <w:szCs w:val="24"/>
+        </w:rPr>
+        <w:t>3. Albero dei Tecnici (Anagrafica Risorse)</w:t>
+      </w:r>
+    </w:p>
+    <w:p>
+      <w:pPr>
+        <w:numPr>
+          <w:ilvl w:val="0"/>
+          <w:numId w:val="9"/>
+        </w:numPr>
+        <w:pBdr>
+          <w:top w:val="nil"/>
+          <w:left w:val="nil"/>
+          <w:bottom w:val="nil"/>
+          <w:right w:val="nil"/>
+          <w:between w:val="nil"/>
+        </w:pBdr>
+        <w:spacing w:line="360" w:lineRule="auto"/>
+        <w:jc w:val="both"/>
+        <w:rPr>
+          <w:sz w:val="24"/>
+          <w:szCs w:val="24"/>
+        </w:rPr>
+      </w:pPr>
+      <w:r>
+        <w:rPr>
+          <w:b/>
+          <w:bCs/>
+          <w:sz w:val="24"/>
+          <w:szCs w:val="24"/>
+        </w:rPr>
+        <w:t>Struttura Dati Implementata:</w:t>
+      </w:r>
+      <w:r>
+        <w:rPr>
+          <w:sz w:val="24"/>
+          <w:szCs w:val="24"/>
+        </w:rPr>
+        <w:t xml:space="preserve"> Albero Binario di Ricerca (BST).</w:t>
+      </w:r>
+    </w:p>
+    <w:p>
+      <w:pPr>
+        <w:numPr>
+          <w:ilvl w:val="0"/>
+          <w:numId w:val="9"/>
+        </w:numPr>
+        <w:pBdr>
+          <w:top w:val="nil"/>
+          <w:left w:val="nil"/>
+          <w:bottom w:val="nil"/>
+          <w:right w:val="nil"/>
+          <w:between w:val="nil"/>
+        </w:pBdr>
+        <w:spacing w:line="360" w:lineRule="auto"/>
+        <w:jc w:val="both"/>
+        <w:rPr>
+          <w:sz w:val="24"/>
+          <w:szCs w:val="24"/>
+        </w:rPr>
+      </w:pPr>
+      <w:r>
+        <w:rPr>
+          <w:b/>
+          <w:bCs/>
+          <w:sz w:val="24"/>
+          <w:szCs w:val="24"/>
+        </w:rPr>
+        <w:t>Ruolo nel Sistema:</w:t>
+      </w:r>
+      <w:r>
+        <w:rPr>
+          <w:sz w:val="24"/>
+          <w:szCs w:val="24"/>
+        </w:rPr>
+        <w:t xml:space="preserve"> Memorizzare e ricercare il personale addetto alla manutenzione.</w:t>
+      </w:r>
+    </w:p>
+    <w:p>
+      <w:pPr>
+        <w:numPr>
+          <w:ilvl w:val="0"/>
+          <w:numId w:val="9"/>
+        </w:numPr>
+        <w:pBdr>
+          <w:top w:val="nil"/>
+          <w:left w:val="nil"/>
+          <w:bottom w:val="nil"/>
+          <w:right w:val="nil"/>
+          <w:between w:val="nil"/>
+        </w:pBdr>
+        <w:spacing w:line="360" w:lineRule="auto"/>
+        <w:jc w:val="both"/>
+        <w:rPr>
+          <w:sz w:val="24"/>
+          <w:szCs w:val="24"/>
+        </w:rPr>
+      </w:pPr>
+      <w:r>
+        <w:rPr>
+          <w:b/>
+          <w:bCs/>
+          <w:sz w:val="24"/>
+          <w:szCs w:val="24"/>
+        </w:rPr>
+        <w:t>Motivazione della Scelta:</w:t>
+      </w:r>
+    </w:p>
+    <w:p>
+      <w:pPr>
+        <w:pBdr>
+          <w:top w:val="nil"/>
+          <w:left w:val="nil"/>
+          <w:bottom w:val="nil"/>
+          <w:right w:val="nil"/>
+          <w:between w:val="nil"/>
+        </w:pBdr>
+        <w:spacing w:line="360" w:lineRule="auto"/>
+        <w:jc w:val="both"/>
+        <w:rPr>
+          <w:sz w:val="24"/>
+          <w:szCs w:val="24"/>
+        </w:rPr>
+      </w:pPr>
+      <w:r>
+        <w:rPr>
+          <w:sz w:val="24"/>
+          <w:szCs w:val="24"/>
+        </w:rPr>
+        <w:t>Il sistema richiede la registrazione dei tecnici tramite un "codice identificativo" univoco e l'assegnazione continua di richieste a risorse "compatibili". L'albero binario di ricerca, ordinato lessicograficamente secondo il codice del tecnico, garantisce prestazioni logaritmiche (</w:t>
+      </w:r>
+      <w:proofErr w:type="gramStart"/>
+      <w:r>
+        <w:rPr>
+          <w:sz w:val="24"/>
+          <w:szCs w:val="24"/>
+        </w:rPr>
+        <w:t>O(</w:t>
+      </w:r>
+      <w:proofErr w:type="gramEnd"/>
+      <w:r>
+        <w:rPr>
+          <w:sz w:val="24"/>
+          <w:szCs w:val="24"/>
+        </w:rPr>
+        <w:t>l</w:t>
+      </w:r>
+      <w:r>
+        <w:rPr>
+          <w:sz w:val="24"/>
+          <w:szCs w:val="24"/>
+        </w:rPr>
+        <w:t xml:space="preserve">og n) nel caso medio) per l'inserimento e, soprattutto, per la ricerca. Questa efficienza è cruciale durante la fase di </w:t>
+      </w:r>
+      <w:r>
+        <w:rPr>
+          <w:i/>
+          <w:iCs/>
+          <w:sz w:val="24"/>
+          <w:szCs w:val="24"/>
+        </w:rPr>
+        <w:t>Assegnazione Automatica</w:t>
+      </w:r>
+      <w:r>
+        <w:rPr>
+          <w:sz w:val="24"/>
+          <w:szCs w:val="24"/>
+        </w:rPr>
+        <w:t>, dove il sistema deve interrogare rapidamente i profili per verificare la specializzazione e il carico di lavoro. Inoltre, una semplice visita simmetrica dell'albero restituisce l'elenco dei tecnici già perfettamente ordinato in senso alfabetico, soddisfacendo i requisiti di visualizzazione a console senza richiedere costosi algoritmi d</w:t>
+      </w:r>
+      <w:r>
+        <w:rPr>
+          <w:sz w:val="24"/>
+          <w:szCs w:val="24"/>
+        </w:rPr>
+        <w:t>i ordinamento</w:t>
+      </w:r>
+      <w:r>
+        <w:rPr>
+          <w:sz w:val="24"/>
+          <w:szCs w:val="24"/>
+        </w:rPr>
+        <w:t xml:space="preserve"> aggiuntivi.</w:t>
+      </w:r>
+    </w:p>
+    <w:p>
+      <w:pPr>
+        <w:pBdr>
+          <w:top w:val="nil"/>
+          <w:left w:val="nil"/>
+          <w:bottom w:val="nil"/>
+          <w:right w:val="nil"/>
+          <w:between w:val="nil"/>
+        </w:pBdr>
+        <w:spacing w:line="360" w:lineRule="auto"/>
+        <w:jc w:val="both"/>
+        <w:rPr>
+          <w:b/>
+          <w:bCs/>
+          <w:sz w:val="24"/>
+          <w:szCs w:val="24"/>
+        </w:rPr>
+      </w:pPr>
+      <w:r>
+        <w:rPr>
+          <w:b/>
+          <w:bCs/>
+          <w:sz w:val="24"/>
+          <w:szCs w:val="24"/>
+        </w:rPr>
+        <w:t>4. Agenda Tecnico (Pianificazione)</w:t>
+      </w:r>
+    </w:p>
+    <w:p>
+      <w:pPr>
+        <w:numPr>
+          <w:ilvl w:val="0"/>
+          <w:numId w:val="10"/>
+        </w:numPr>
+        <w:pBdr>
+          <w:top w:val="nil"/>
+          <w:left w:val="nil"/>
+          <w:bottom w:val="nil"/>
+          <w:right w:val="nil"/>
+          <w:between w:val="nil"/>
+        </w:pBdr>
+        <w:spacing w:line="360" w:lineRule="auto"/>
+        <w:jc w:val="both"/>
+        <w:rPr>
+          <w:sz w:val="24"/>
+          <w:szCs w:val="24"/>
+        </w:rPr>
+      </w:pPr>
+      <w:r>
+        <w:rPr>
+          <w:b/>
+          <w:bCs/>
+          <w:sz w:val="24"/>
+          <w:szCs w:val="24"/>
+        </w:rPr>
+        <w:t>Struttura Dati Implementata:</w:t>
+      </w:r>
+      <w:r>
+        <w:rPr>
+          <w:sz w:val="24"/>
+          <w:szCs w:val="24"/>
+        </w:rPr>
+        <w:t xml:space="preserve"> Albero Binario di Ricerca (BST) integrato nel nodo del Tecnico.</w:t>
+      </w:r>
+    </w:p>
+    <w:p>
+      <w:pPr>
+        <w:numPr>
+          <w:ilvl w:val="0"/>
+          <w:numId w:val="10"/>
+        </w:numPr>
+        <w:pBdr>
+          <w:top w:val="nil"/>
+          <w:left w:val="nil"/>
+          <w:bottom w:val="nil"/>
+          <w:right w:val="nil"/>
+          <w:between w:val="nil"/>
+        </w:pBdr>
+        <w:spacing w:line="360" w:lineRule="auto"/>
+        <w:jc w:val="both"/>
+        <w:rPr>
+          <w:sz w:val="24"/>
+          <w:szCs w:val="24"/>
+        </w:rPr>
+      </w:pPr>
+      <w:r>
+        <w:rPr>
+          <w:b/>
+          <w:bCs/>
+          <w:sz w:val="24"/>
+          <w:szCs w:val="24"/>
+        </w:rPr>
+        <w:t>Ruolo nel Sistema:</w:t>
+      </w:r>
+      <w:r>
+        <w:rPr>
+          <w:sz w:val="24"/>
+          <w:szCs w:val="24"/>
+        </w:rPr>
+        <w:t xml:space="preserve"> Tracciare gli appuntamenti pianificati di un singolo manutentore.</w:t>
+      </w:r>
+    </w:p>
+    <w:p>
+      <w:pPr>
+        <w:numPr>
+          <w:ilvl w:val="0"/>
+          <w:numId w:val="10"/>
+        </w:numPr>
+        <w:pBdr>
+          <w:top w:val="nil"/>
+          <w:left w:val="nil"/>
+          <w:bottom w:val="nil"/>
+          <w:right w:val="nil"/>
+          <w:between w:val="nil"/>
+        </w:pBdr>
+        <w:spacing w:line="360" w:lineRule="auto"/>
+        <w:jc w:val="both"/>
+        <w:rPr>
+          <w:sz w:val="24"/>
+          <w:szCs w:val="24"/>
+        </w:rPr>
+      </w:pPr>
+      <w:r>
+        <w:rPr>
+          <w:b/>
+          <w:bCs/>
+          <w:sz w:val="24"/>
+          <w:szCs w:val="24"/>
+        </w:rPr>
+        <w:t>Motivazione della Scelta:</w:t>
+      </w:r>
+    </w:p>
+    <w:p>
+      <w:pPr>
+        <w:pBdr>
+          <w:top w:val="nil"/>
+          <w:left w:val="nil"/>
+          <w:bottom w:val="nil"/>
+          <w:right w:val="nil"/>
+          <w:between w:val="nil"/>
+        </w:pBdr>
+        <w:spacing w:line="360" w:lineRule="auto"/>
+        <w:jc w:val="both"/>
+        <w:rPr>
+          <w:sz w:val="24"/>
+          <w:szCs w:val="24"/>
+        </w:rPr>
+      </w:pPr>
+      <w:r>
+        <w:rPr>
+          <w:sz w:val="24"/>
+          <w:szCs w:val="24"/>
+        </w:rPr>
+        <w:t>Per permettere</w:t>
+      </w:r>
+      <w:r>
+        <w:rPr>
+          <w:sz w:val="24"/>
+          <w:szCs w:val="24"/>
+        </w:rPr>
+        <w:t xml:space="preserve"> il controllo e la "verifica dei conflitti nella pianificazione" per fasce orarie e date</w:t>
+      </w:r>
+      <w:r>
+        <w:rPr>
+          <w:sz w:val="24"/>
+          <w:szCs w:val="24"/>
+        </w:rPr>
+        <w:t xml:space="preserve"> si decide di u</w:t>
+      </w:r>
+      <w:r>
+        <w:rPr>
+          <w:sz w:val="24"/>
+          <w:szCs w:val="24"/>
+        </w:rPr>
+        <w:t xml:space="preserve">tilizzare un BST dedicato per l'agenda di ciascun operatore, in cui i nodi sono ordinati in modo cronologico (chiave basata su </w:t>
+      </w:r>
+      <w:proofErr w:type="spellStart"/>
+      <w:r>
+        <w:rPr>
+          <w:sz w:val="24"/>
+          <w:szCs w:val="24"/>
+        </w:rPr>
+        <w:t>timestamp</w:t>
+      </w:r>
+      <w:proofErr w:type="spellEnd"/>
+      <w:r>
+        <w:rPr>
+          <w:sz w:val="24"/>
+          <w:szCs w:val="24"/>
+        </w:rPr>
+        <w:t xml:space="preserve"> o combinazione di data e ora), permette di validare in modo elegantissimo i nuovi inserimenti. Durante l'aggiunta di un nuovo appuntamento, il percorso di attraversamento radice-foglia consente di intercettare eventuali sovrapposizioni orarie in tempo logaritmico (</w:t>
+      </w:r>
+      <w:proofErr w:type="gramStart"/>
+      <w:r>
+        <w:rPr>
+          <w:sz w:val="24"/>
+          <w:szCs w:val="24"/>
+        </w:rPr>
+        <w:t>O(</w:t>
+      </w:r>
+      <w:proofErr w:type="gramEnd"/>
+      <w:r>
+        <w:rPr>
+          <w:sz w:val="24"/>
+          <w:szCs w:val="24"/>
+        </w:rPr>
+        <w:t xml:space="preserve">log n)). Questo </w:t>
+      </w:r>
+      <w:r>
+        <w:rPr>
+          <w:sz w:val="24"/>
+          <w:szCs w:val="24"/>
+        </w:rPr>
+        <w:lastRenderedPageBreak/>
+        <w:t>approccio rende intrinsecamente impossibile la schedulazione di interventi concorrenti, garantendo la robustezza semantica richiesta dalle specifiche e permettendo la visualizzazione istantanea degli impegni cronologici.</w:t>
+      </w:r>
+    </w:p>
+    <w:p>
+      <w:pPr>
+        <w:pBdr>
+          <w:top w:val="nil"/>
+          <w:left w:val="nil"/>
+          <w:bottom w:val="nil"/>
+          <w:right w:val="nil"/>
+          <w:between w:val="nil"/>
+        </w:pBdr>
+        <w:spacing w:line="360" w:lineRule="auto"/>
+        <w:jc w:val="both"/>
+      </w:pPr>
+    </w:p>
+    <w:p>
+      <w:pPr>
+        <w:pStyle w:val="Titolo2"/>
+      </w:pPr>
+      <w:r>
+        <w:t>3. Progettazione e Architettura</w:t>
+      </w:r>
+    </w:p>
+    <w:p>
+      <w:pPr>
+        <w:pBdr>
+          <w:top w:val="nil"/>
+          <w:left w:val="nil"/>
+          <w:bottom w:val="nil"/>
+          <w:right w:val="nil"/>
+          <w:between w:val="nil"/>
+        </w:pBdr>
+        <w:spacing w:line="360" w:lineRule="auto"/>
+        <w:jc w:val="both"/>
+        <w:rPr>
+          <w:sz w:val="24"/>
+          <w:szCs w:val="24"/>
+        </w:rPr>
+      </w:pPr>
+      <w:r>
+        <w:rPr>
+          <w:sz w:val="24"/>
+          <w:szCs w:val="24"/>
+        </w:rPr>
+        <w:t xml:space="preserve">Il sistema adotta uno stile architetturale </w:t>
+      </w:r>
+      <w:r>
+        <w:rPr>
+          <w:b/>
+          <w:bCs/>
+          <w:sz w:val="24"/>
+          <w:szCs w:val="24"/>
+        </w:rPr>
+        <w:t>modulare a strati</w:t>
+      </w:r>
+      <w:r>
+        <w:rPr>
+          <w:sz w:val="24"/>
+          <w:szCs w:val="24"/>
+        </w:rPr>
+        <w:t xml:space="preserve">. La scomposizione del software è guidata dal principio dell'incapsulamento e dell'information </w:t>
+      </w:r>
+      <w:proofErr w:type="spellStart"/>
+      <w:r>
+        <w:rPr>
+          <w:sz w:val="24"/>
+          <w:szCs w:val="24"/>
+        </w:rPr>
+        <w:t>hiding</w:t>
+      </w:r>
+      <w:proofErr w:type="spellEnd"/>
+      <w:r>
+        <w:rPr>
+          <w:sz w:val="24"/>
+          <w:szCs w:val="24"/>
+        </w:rPr>
+        <w:t>, separando la gestione dell'interfaccia utente, la logica applicativa e le strutture dati deputate alla memorizzazione e manipolazione delle informazioni.</w:t>
+      </w:r>
+    </w:p>
+    <w:p>
+      <w:pPr>
+        <w:pBdr>
+          <w:top w:val="nil"/>
+          <w:left w:val="nil"/>
+          <w:bottom w:val="nil"/>
+          <w:right w:val="nil"/>
+          <w:between w:val="nil"/>
+        </w:pBdr>
+        <w:spacing w:line="360" w:lineRule="auto"/>
+        <w:jc w:val="both"/>
+        <w:rPr>
+          <w:b/>
+          <w:bCs/>
+          <w:sz w:val="24"/>
+          <w:szCs w:val="24"/>
+        </w:rPr>
+      </w:pPr>
+      <w:r>
+        <w:rPr>
+          <w:b/>
+          <w:bCs/>
+          <w:sz w:val="24"/>
+          <w:szCs w:val="24"/>
+        </w:rPr>
+        <w:t>3.</w:t>
+      </w:r>
+      <w:r>
+        <w:rPr>
+          <w:b/>
+          <w:bCs/>
+          <w:sz w:val="24"/>
+          <w:szCs w:val="24"/>
+        </w:rPr>
+        <w:t>1 Scomposizione in Moduli</w:t>
+      </w:r>
+    </w:p>
+    <w:p>
+      <w:pPr>
+        <w:pBdr>
+          <w:top w:val="nil"/>
+          <w:left w:val="nil"/>
+          <w:bottom w:val="nil"/>
+          <w:right w:val="nil"/>
+          <w:between w:val="nil"/>
+        </w:pBdr>
+        <w:spacing w:line="360" w:lineRule="auto"/>
+        <w:jc w:val="both"/>
+        <w:rPr>
+          <w:sz w:val="24"/>
+          <w:szCs w:val="24"/>
+        </w:rPr>
+      </w:pPr>
+      <w:r>
+        <w:rPr>
+          <w:sz w:val="24"/>
+          <w:szCs w:val="24"/>
+        </w:rPr>
+        <w:t xml:space="preserve">L'architettura del codice sorgente è organizzata in tre macro-livelli logici, formalizzati attraverso l'uso accoppiato di file </w:t>
+      </w:r>
+      <w:proofErr w:type="spellStart"/>
+      <w:r>
+        <w:rPr>
+          <w:sz w:val="24"/>
+          <w:szCs w:val="24"/>
+        </w:rPr>
+        <w:t>header</w:t>
+      </w:r>
+      <w:proofErr w:type="spellEnd"/>
+      <w:r>
+        <w:rPr>
+          <w:sz w:val="24"/>
+          <w:szCs w:val="24"/>
+        </w:rPr>
+        <w:t xml:space="preserve"> (.h) e file sorgente (.c):</w:t>
+      </w:r>
+    </w:p>
+    <w:p>
+      <w:pPr>
+        <w:numPr>
+          <w:ilvl w:val="0"/>
+          <w:numId w:val="11"/>
+        </w:numPr>
+        <w:pBdr>
+          <w:top w:val="nil"/>
+          <w:left w:val="nil"/>
+          <w:bottom w:val="nil"/>
+          <w:right w:val="nil"/>
+          <w:between w:val="nil"/>
+        </w:pBdr>
+        <w:spacing w:line="360" w:lineRule="auto"/>
+        <w:jc w:val="both"/>
+        <w:rPr>
+          <w:sz w:val="24"/>
+          <w:szCs w:val="24"/>
+        </w:rPr>
+      </w:pPr>
+      <w:r>
+        <w:rPr>
+          <w:b/>
+          <w:bCs/>
+          <w:sz w:val="24"/>
+          <w:szCs w:val="24"/>
+        </w:rPr>
+        <w:t>Livello di Presentazione e Controllo (</w:t>
+      </w:r>
+      <w:proofErr w:type="spellStart"/>
+      <w:r>
+        <w:rPr>
+          <w:b/>
+          <w:bCs/>
+          <w:sz w:val="24"/>
+          <w:szCs w:val="24"/>
+        </w:rPr>
+        <w:t>main.c</w:t>
+      </w:r>
+      <w:proofErr w:type="spellEnd"/>
+      <w:r>
+        <w:rPr>
+          <w:b/>
+          <w:bCs/>
+          <w:sz w:val="24"/>
+          <w:szCs w:val="24"/>
+        </w:rPr>
+        <w:t xml:space="preserve">, </w:t>
+      </w:r>
+      <w:proofErr w:type="spellStart"/>
+      <w:r>
+        <w:rPr>
+          <w:b/>
+          <w:bCs/>
+          <w:sz w:val="24"/>
+          <w:szCs w:val="24"/>
+        </w:rPr>
+        <w:t>utilita.c</w:t>
+      </w:r>
+      <w:proofErr w:type="spellEnd"/>
+      <w:r>
+        <w:rPr>
+          <w:b/>
+          <w:bCs/>
+          <w:sz w:val="24"/>
+          <w:szCs w:val="24"/>
+        </w:rPr>
+        <w:t>)</w:t>
+      </w:r>
+      <w:r>
+        <w:rPr>
+          <w:sz w:val="24"/>
+          <w:szCs w:val="24"/>
+        </w:rPr>
+        <w:t>:</w:t>
+      </w:r>
+    </w:p>
+    <w:p>
+      <w:pPr>
+        <w:pBdr>
+          <w:top w:val="nil"/>
+          <w:left w:val="nil"/>
+          <w:bottom w:val="nil"/>
+          <w:right w:val="nil"/>
+          <w:between w:val="nil"/>
+        </w:pBdr>
+        <w:spacing w:line="360" w:lineRule="auto"/>
+        <w:jc w:val="both"/>
+        <w:rPr>
+          <w:sz w:val="24"/>
+          <w:szCs w:val="24"/>
+        </w:rPr>
+      </w:pPr>
+      <w:r>
+        <w:rPr>
+          <w:sz w:val="24"/>
+          <w:szCs w:val="24"/>
+        </w:rPr>
+        <w:t>Gestisce l'interfaccia a console, il menu interattivo e il coordinamento delle operazioni principali in risposta agli input dell'utente.</w:t>
+      </w:r>
+    </w:p>
+    <w:p>
+      <w:pPr>
+        <w:numPr>
+          <w:ilvl w:val="0"/>
+          <w:numId w:val="11"/>
+        </w:numPr>
+        <w:pBdr>
+          <w:top w:val="nil"/>
+          <w:left w:val="nil"/>
+          <w:bottom w:val="nil"/>
+          <w:right w:val="nil"/>
+          <w:between w:val="nil"/>
+        </w:pBdr>
+        <w:spacing w:line="360" w:lineRule="auto"/>
+        <w:jc w:val="both"/>
+        <w:rPr>
+          <w:sz w:val="24"/>
+          <w:szCs w:val="24"/>
+        </w:rPr>
+      </w:pPr>
+      <w:r>
+        <w:rPr>
+          <w:b/>
+          <w:bCs/>
+          <w:sz w:val="24"/>
+          <w:szCs w:val="24"/>
+        </w:rPr>
+        <w:t>Livello delle Strutture Dati Astratte e Logica (</w:t>
+      </w:r>
+      <w:proofErr w:type="spellStart"/>
+      <w:r>
+        <w:rPr>
+          <w:b/>
+          <w:bCs/>
+          <w:sz w:val="24"/>
+          <w:szCs w:val="24"/>
+        </w:rPr>
+        <w:t>archivioRichieste.c</w:t>
+      </w:r>
+      <w:proofErr w:type="spellEnd"/>
+      <w:r>
+        <w:rPr>
+          <w:b/>
+          <w:bCs/>
+          <w:sz w:val="24"/>
+          <w:szCs w:val="24"/>
+        </w:rPr>
+        <w:t xml:space="preserve">, </w:t>
+      </w:r>
+      <w:proofErr w:type="spellStart"/>
+      <w:r>
+        <w:rPr>
+          <w:b/>
+          <w:bCs/>
+          <w:sz w:val="24"/>
+          <w:szCs w:val="24"/>
+        </w:rPr>
+        <w:t>codaPriorita.c</w:t>
+      </w:r>
+      <w:proofErr w:type="spellEnd"/>
+      <w:r>
+        <w:rPr>
+          <w:b/>
+          <w:bCs/>
+          <w:sz w:val="24"/>
+          <w:szCs w:val="24"/>
+        </w:rPr>
+        <w:t xml:space="preserve">, </w:t>
+      </w:r>
+      <w:proofErr w:type="spellStart"/>
+      <w:r>
+        <w:rPr>
+          <w:b/>
+          <w:bCs/>
+          <w:sz w:val="24"/>
+          <w:szCs w:val="24"/>
+        </w:rPr>
+        <w:t>alberoTecnici.c</w:t>
+      </w:r>
+      <w:proofErr w:type="spellEnd"/>
+      <w:r>
+        <w:rPr>
+          <w:b/>
+          <w:bCs/>
+          <w:sz w:val="24"/>
+          <w:szCs w:val="24"/>
+        </w:rPr>
+        <w:t xml:space="preserve">, </w:t>
+      </w:r>
+      <w:proofErr w:type="spellStart"/>
+      <w:r>
+        <w:rPr>
+          <w:b/>
+          <w:bCs/>
+          <w:sz w:val="24"/>
+          <w:szCs w:val="24"/>
+        </w:rPr>
+        <w:t>agendaTecnico.c</w:t>
+      </w:r>
+      <w:proofErr w:type="spellEnd"/>
+      <w:r>
+        <w:rPr>
+          <w:b/>
+          <w:bCs/>
+          <w:sz w:val="24"/>
+          <w:szCs w:val="24"/>
+        </w:rPr>
+        <w:t xml:space="preserve">, </w:t>
+      </w:r>
+      <w:proofErr w:type="spellStart"/>
+      <w:r>
+        <w:rPr>
+          <w:b/>
+          <w:bCs/>
+          <w:sz w:val="24"/>
+          <w:szCs w:val="24"/>
+        </w:rPr>
+        <w:t>report.c</w:t>
+      </w:r>
+      <w:proofErr w:type="spellEnd"/>
+      <w:r>
+        <w:rPr>
+          <w:b/>
+          <w:bCs/>
+          <w:sz w:val="24"/>
+          <w:szCs w:val="24"/>
+        </w:rPr>
+        <w:t>)</w:t>
+      </w:r>
+      <w:r>
+        <w:rPr>
+          <w:sz w:val="24"/>
+          <w:szCs w:val="24"/>
+        </w:rPr>
+        <w:t>:</w:t>
+      </w:r>
+    </w:p>
+    <w:p>
+      <w:pPr>
+        <w:pBdr>
+          <w:top w:val="nil"/>
+          <w:left w:val="nil"/>
+          <w:bottom w:val="nil"/>
+          <w:right w:val="nil"/>
+          <w:between w:val="nil"/>
+        </w:pBdr>
+        <w:spacing w:line="360" w:lineRule="auto"/>
+        <w:jc w:val="both"/>
+        <w:rPr>
+          <w:sz w:val="24"/>
+          <w:szCs w:val="24"/>
+        </w:rPr>
+      </w:pPr>
+      <w:r>
+        <w:rPr>
+          <w:sz w:val="24"/>
+          <w:szCs w:val="24"/>
+        </w:rPr>
+        <w:t>Implementa i motori algoritmici del sistema. Questo strato non conosce i dettagli dell'interfaccia utente, ma espone le primitive di manipolazione (inserimento, estrazione, bilanciamento, calcolo statistico) per le ADT descritte nel capitolo precedente.</w:t>
+      </w:r>
+    </w:p>
+    <w:p>
+      <w:pPr>
+        <w:numPr>
+          <w:ilvl w:val="0"/>
+          <w:numId w:val="11"/>
+        </w:numPr>
+        <w:pBdr>
+          <w:top w:val="nil"/>
+          <w:left w:val="nil"/>
+          <w:bottom w:val="nil"/>
+          <w:right w:val="nil"/>
+          <w:between w:val="nil"/>
+        </w:pBdr>
+        <w:spacing w:line="360" w:lineRule="auto"/>
+        <w:jc w:val="both"/>
+        <w:rPr>
+          <w:sz w:val="24"/>
+          <w:szCs w:val="24"/>
+        </w:rPr>
+      </w:pPr>
+      <w:r>
+        <w:rPr>
+          <w:b/>
+          <w:bCs/>
+          <w:sz w:val="24"/>
+          <w:szCs w:val="24"/>
+        </w:rPr>
+        <w:t>Livello delle Entità Base (</w:t>
+      </w:r>
+      <w:proofErr w:type="spellStart"/>
+      <w:r>
+        <w:rPr>
+          <w:b/>
+          <w:bCs/>
+          <w:sz w:val="24"/>
+          <w:szCs w:val="24"/>
+        </w:rPr>
+        <w:t>richiesta.c</w:t>
+      </w:r>
+      <w:proofErr w:type="spellEnd"/>
+      <w:r>
+        <w:rPr>
+          <w:b/>
+          <w:bCs/>
+          <w:sz w:val="24"/>
+          <w:szCs w:val="24"/>
+        </w:rPr>
+        <w:t xml:space="preserve">, </w:t>
+      </w:r>
+      <w:proofErr w:type="spellStart"/>
+      <w:r>
+        <w:rPr>
+          <w:b/>
+          <w:bCs/>
+          <w:sz w:val="24"/>
+          <w:szCs w:val="24"/>
+        </w:rPr>
+        <w:t>tecnico.c</w:t>
+      </w:r>
+      <w:proofErr w:type="spellEnd"/>
+      <w:r>
+        <w:rPr>
+          <w:b/>
+          <w:bCs/>
+          <w:sz w:val="24"/>
+          <w:szCs w:val="24"/>
+        </w:rPr>
+        <w:t>)</w:t>
+      </w:r>
+      <w:r>
+        <w:rPr>
+          <w:sz w:val="24"/>
+          <w:szCs w:val="24"/>
+        </w:rPr>
+        <w:t>:</w:t>
+      </w:r>
+    </w:p>
+    <w:p>
+      <w:pPr>
+        <w:pBdr>
+          <w:top w:val="nil"/>
+          <w:left w:val="nil"/>
+          <w:bottom w:val="nil"/>
+          <w:right w:val="nil"/>
+          <w:between w:val="nil"/>
+        </w:pBdr>
+        <w:spacing w:line="360" w:lineRule="auto"/>
+        <w:jc w:val="both"/>
+        <w:rPr>
+          <w:sz w:val="24"/>
+          <w:szCs w:val="24"/>
+        </w:rPr>
+      </w:pPr>
+      <w:r>
+        <w:rPr>
+          <w:sz w:val="24"/>
+          <w:szCs w:val="24"/>
+        </w:rPr>
+        <w:t xml:space="preserve">Definisce i tipi di dato strutturati fondamentali e i relativi metodi di astrazione (costruttori, distruttori, funzioni di confronto e funzioni di accesso </w:t>
+      </w:r>
+      <w:r>
+        <w:rPr>
+          <w:i/>
+          <w:iCs/>
+          <w:sz w:val="24"/>
+          <w:szCs w:val="24"/>
+        </w:rPr>
+        <w:t>getter/setter</w:t>
+      </w:r>
+      <w:r>
+        <w:rPr>
+          <w:sz w:val="24"/>
+          <w:szCs w:val="24"/>
+        </w:rPr>
+        <w:t>).</w:t>
+      </w:r>
+    </w:p>
+    <w:p>
+      <w:pPr>
+        <w:pBdr>
+          <w:top w:val="nil"/>
+          <w:left w:val="nil"/>
+          <w:bottom w:val="nil"/>
+          <w:right w:val="nil"/>
+          <w:between w:val="nil"/>
+        </w:pBdr>
+        <w:spacing w:line="360" w:lineRule="auto"/>
+        <w:jc w:val="both"/>
+        <w:rPr>
+          <w:b/>
+          <w:bCs/>
+          <w:sz w:val="24"/>
+          <w:szCs w:val="24"/>
+        </w:rPr>
+      </w:pPr>
+      <w:r>
+        <w:rPr>
+          <w:b/>
+          <w:bCs/>
+          <w:sz w:val="24"/>
+          <w:szCs w:val="24"/>
+        </w:rPr>
+        <w:t>3.2 Interazione tra i Moduli e Flussi Logici</w:t>
+      </w:r>
+    </w:p>
+    <w:p>
+      <w:pPr>
+        <w:pBdr>
+          <w:top w:val="nil"/>
+          <w:left w:val="nil"/>
+          <w:bottom w:val="nil"/>
+          <w:right w:val="nil"/>
+          <w:between w:val="nil"/>
+        </w:pBdr>
+        <w:spacing w:line="360" w:lineRule="auto"/>
+        <w:jc w:val="both"/>
+        <w:rPr>
+          <w:sz w:val="24"/>
+          <w:szCs w:val="24"/>
+        </w:rPr>
+      </w:pPr>
+      <w:r>
+        <w:rPr>
+          <w:sz w:val="24"/>
+          <w:szCs w:val="24"/>
+        </w:rPr>
+        <w:t xml:space="preserve">L'interazione tra i moduli segue flussi asincroni e sincroni guidati dagli eventi del menu principale. Di seguito vengono dettagliati i tre flussi </w:t>
+      </w:r>
+      <w:r>
+        <w:rPr>
+          <w:sz w:val="24"/>
+          <w:szCs w:val="24"/>
+        </w:rPr>
+        <w:t>principali</w:t>
+      </w:r>
+      <w:r>
+        <w:rPr>
+          <w:sz w:val="24"/>
+          <w:szCs w:val="24"/>
+        </w:rPr>
+        <w:t xml:space="preserve"> del sistema:</w:t>
+      </w:r>
+    </w:p>
+    <w:p>
+      <w:pPr>
+        <w:numPr>
+          <w:ilvl w:val="0"/>
+          <w:numId w:val="12"/>
+        </w:numPr>
+        <w:pBdr>
+          <w:top w:val="nil"/>
+          <w:left w:val="nil"/>
+          <w:bottom w:val="nil"/>
+          <w:right w:val="nil"/>
+          <w:between w:val="nil"/>
+        </w:pBdr>
+        <w:spacing w:line="360" w:lineRule="auto"/>
+        <w:jc w:val="both"/>
+        <w:rPr>
+          <w:sz w:val="24"/>
+          <w:szCs w:val="24"/>
+        </w:rPr>
+      </w:pPr>
+      <w:r>
+        <w:rPr>
+          <w:b/>
+          <w:bCs/>
+          <w:sz w:val="24"/>
+          <w:szCs w:val="24"/>
+        </w:rPr>
+        <w:t>Flusso di Registrazione di una Segnalazione</w:t>
+      </w:r>
+      <w:r>
+        <w:rPr>
+          <w:sz w:val="24"/>
+          <w:szCs w:val="24"/>
+        </w:rPr>
+        <w:t>:</w:t>
+      </w:r>
+    </w:p>
+    <w:p>
+      <w:pPr>
+        <w:pBdr>
+          <w:top w:val="nil"/>
+          <w:left w:val="nil"/>
+          <w:bottom w:val="nil"/>
+          <w:right w:val="nil"/>
+          <w:between w:val="nil"/>
+        </w:pBdr>
+        <w:spacing w:line="360" w:lineRule="auto"/>
+        <w:jc w:val="both"/>
+        <w:rPr>
+          <w:sz w:val="24"/>
+          <w:szCs w:val="24"/>
+        </w:rPr>
+      </w:pPr>
+      <w:r>
+        <w:rPr>
+          <w:sz w:val="24"/>
+          <w:szCs w:val="24"/>
+        </w:rPr>
+        <w:t xml:space="preserve">Quando l'utente inserisce una nuova criticità condominiale, il modulo </w:t>
+      </w:r>
+      <w:proofErr w:type="spellStart"/>
+      <w:r>
+        <w:rPr>
+          <w:sz w:val="24"/>
+          <w:szCs w:val="24"/>
+        </w:rPr>
+        <w:t>main</w:t>
+      </w:r>
+      <w:proofErr w:type="spellEnd"/>
+      <w:r>
+        <w:rPr>
+          <w:sz w:val="24"/>
+          <w:szCs w:val="24"/>
+        </w:rPr>
+        <w:t xml:space="preserve"> invoca il costruttore presente in </w:t>
+      </w:r>
+      <w:proofErr w:type="spellStart"/>
+      <w:r>
+        <w:rPr>
+          <w:sz w:val="24"/>
+          <w:szCs w:val="24"/>
+        </w:rPr>
+        <w:t>richiesta.c</w:t>
+      </w:r>
+      <w:proofErr w:type="spellEnd"/>
+      <w:r>
+        <w:rPr>
+          <w:sz w:val="24"/>
+          <w:szCs w:val="24"/>
+        </w:rPr>
+        <w:t xml:space="preserve"> per istanziare l'oggetto in memoria. Successivamente, il puntatore a tale richiesta viene inviato simultaneamente a due moduli distinti:</w:t>
+      </w:r>
+    </w:p>
+    <w:p>
+      <w:pPr>
+        <w:numPr>
+          <w:ilvl w:val="1"/>
+          <w:numId w:val="12"/>
+        </w:numPr>
+        <w:pBdr>
+          <w:top w:val="nil"/>
+          <w:left w:val="nil"/>
+          <w:bottom w:val="nil"/>
+          <w:right w:val="nil"/>
+          <w:between w:val="nil"/>
+        </w:pBdr>
+        <w:spacing w:line="360" w:lineRule="auto"/>
+        <w:jc w:val="both"/>
+        <w:rPr>
+          <w:sz w:val="24"/>
+          <w:szCs w:val="24"/>
+        </w:rPr>
+      </w:pPr>
+      <w:r>
+        <w:rPr>
+          <w:sz w:val="24"/>
+          <w:szCs w:val="24"/>
+        </w:rPr>
+        <w:lastRenderedPageBreak/>
+        <w:t xml:space="preserve">A </w:t>
+      </w:r>
+      <w:proofErr w:type="spellStart"/>
+      <w:r>
+        <w:rPr>
+          <w:sz w:val="24"/>
+          <w:szCs w:val="24"/>
+        </w:rPr>
+        <w:t>archivioRichieste.c</w:t>
+      </w:r>
+      <w:proofErr w:type="spellEnd"/>
+      <w:r>
+        <w:rPr>
+          <w:sz w:val="24"/>
+          <w:szCs w:val="24"/>
+        </w:rPr>
+        <w:t xml:space="preserve">, che lo inserisce stabilmente in coda alla lista concatenata per garantirne la persistenza storica e la futura rendicontazione statistica tramite </w:t>
+      </w:r>
+      <w:proofErr w:type="spellStart"/>
+      <w:r>
+        <w:rPr>
+          <w:sz w:val="24"/>
+          <w:szCs w:val="24"/>
+        </w:rPr>
+        <w:t>report.c</w:t>
+      </w:r>
+      <w:proofErr w:type="spellEnd"/>
+      <w:r>
+        <w:rPr>
+          <w:sz w:val="24"/>
+          <w:szCs w:val="24"/>
+        </w:rPr>
+        <w:t>.</w:t>
+      </w:r>
+    </w:p>
+    <w:p>
+      <w:pPr>
+        <w:numPr>
+          <w:ilvl w:val="1"/>
+          <w:numId w:val="12"/>
+        </w:numPr>
+        <w:pBdr>
+          <w:top w:val="nil"/>
+          <w:left w:val="nil"/>
+          <w:bottom w:val="nil"/>
+          <w:right w:val="nil"/>
+          <w:between w:val="nil"/>
+        </w:pBdr>
+        <w:spacing w:line="360" w:lineRule="auto"/>
+        <w:jc w:val="both"/>
+        <w:rPr>
+          <w:sz w:val="24"/>
+          <w:szCs w:val="24"/>
+        </w:rPr>
+      </w:pPr>
+      <w:r>
+        <w:rPr>
+          <w:sz w:val="24"/>
+          <w:szCs w:val="24"/>
+        </w:rPr>
+        <w:t xml:space="preserve">A </w:t>
+      </w:r>
+      <w:proofErr w:type="spellStart"/>
+      <w:r>
+        <w:rPr>
+          <w:sz w:val="24"/>
+          <w:szCs w:val="24"/>
+        </w:rPr>
+        <w:t>codaPriorita.c</w:t>
+      </w:r>
+      <w:proofErr w:type="spellEnd"/>
+      <w:r>
+        <w:rPr>
+          <w:sz w:val="24"/>
+          <w:szCs w:val="24"/>
+        </w:rPr>
+        <w:t xml:space="preserve">, che inserisce il medesimo puntatore all'interno del Max-Heap, riorganizzando la struttura in tempo </w:t>
+      </w:r>
+      <w:proofErr w:type="gramStart"/>
+      <w:r>
+        <w:rPr>
+          <w:sz w:val="24"/>
+          <w:szCs w:val="24"/>
+        </w:rPr>
+        <w:t>O(</w:t>
+      </w:r>
+      <w:proofErr w:type="gramEnd"/>
+      <w:r>
+        <w:rPr>
+          <w:sz w:val="24"/>
+          <w:szCs w:val="24"/>
+        </w:rPr>
+        <w:t>log n) in base al livello di urgenza.</w:t>
+      </w:r>
+    </w:p>
+    <w:p>
+      <w:pPr>
+        <w:numPr>
+          <w:ilvl w:val="0"/>
+          <w:numId w:val="12"/>
+        </w:numPr>
+        <w:pBdr>
+          <w:top w:val="nil"/>
+          <w:left w:val="nil"/>
+          <w:bottom w:val="nil"/>
+          <w:right w:val="nil"/>
+          <w:between w:val="nil"/>
+        </w:pBdr>
+        <w:spacing w:line="360" w:lineRule="auto"/>
+        <w:jc w:val="both"/>
+        <w:rPr>
+          <w:sz w:val="24"/>
+          <w:szCs w:val="24"/>
+        </w:rPr>
+      </w:pPr>
+      <w:r>
+        <w:rPr>
+          <w:b/>
+          <w:bCs/>
+          <w:sz w:val="24"/>
+          <w:szCs w:val="24"/>
+        </w:rPr>
+        <w:t>Flusso di Assegnazione e Risoluzione Conflitti</w:t>
+      </w:r>
+      <w:r>
+        <w:rPr>
+          <w:sz w:val="24"/>
+          <w:szCs w:val="24"/>
+        </w:rPr>
+        <w:t>:</w:t>
+      </w:r>
+    </w:p>
+    <w:p>
+      <w:pPr>
+        <w:pBdr>
+          <w:top w:val="nil"/>
+          <w:left w:val="nil"/>
+          <w:bottom w:val="nil"/>
+          <w:right w:val="nil"/>
+          <w:between w:val="nil"/>
+        </w:pBdr>
+        <w:spacing w:line="360" w:lineRule="auto"/>
+        <w:jc w:val="both"/>
+        <w:rPr>
+          <w:sz w:val="24"/>
+          <w:szCs w:val="24"/>
+        </w:rPr>
+      </w:pPr>
+      <w:r>
+        <w:rPr>
+          <w:sz w:val="24"/>
+          <w:szCs w:val="24"/>
+        </w:rPr>
+        <w:t>L'operazione di pianificazione richiede una stretta cooperazione transazionale tra i moduli delle ADT:</w:t>
+      </w:r>
+    </w:p>
+    <w:p>
+      <w:pPr>
+        <w:numPr>
+          <w:ilvl w:val="1"/>
+          <w:numId w:val="13"/>
+        </w:numPr>
+        <w:pBdr>
+          <w:top w:val="nil"/>
+          <w:left w:val="nil"/>
+          <w:bottom w:val="nil"/>
+          <w:right w:val="nil"/>
+          <w:between w:val="nil"/>
+        </w:pBdr>
+        <w:spacing w:line="360" w:lineRule="auto"/>
+        <w:jc w:val="both"/>
+        <w:rPr>
+          <w:sz w:val="24"/>
+          <w:szCs w:val="24"/>
+        </w:rPr>
+      </w:pPr>
+      <w:r>
+        <w:rPr>
+          <w:sz w:val="24"/>
+          <w:szCs w:val="24"/>
+        </w:rPr>
+        <w:t xml:space="preserve">Il </w:t>
+      </w:r>
+      <w:proofErr w:type="spellStart"/>
+      <w:r>
+        <w:rPr>
+          <w:sz w:val="24"/>
+          <w:szCs w:val="24"/>
+        </w:rPr>
+        <w:t>main</w:t>
+      </w:r>
+      <w:proofErr w:type="spellEnd"/>
+      <w:r>
+        <w:rPr>
+          <w:sz w:val="24"/>
+          <w:szCs w:val="24"/>
+        </w:rPr>
+        <w:t xml:space="preserve"> richiede l'estrazione della richiesta prioritaria a </w:t>
+      </w:r>
+      <w:proofErr w:type="spellStart"/>
+      <w:r>
+        <w:rPr>
+          <w:sz w:val="24"/>
+          <w:szCs w:val="24"/>
+        </w:rPr>
+        <w:t>codaPriorita.c</w:t>
+      </w:r>
+      <w:proofErr w:type="spellEnd"/>
+      <w:r>
+        <w:rPr>
+          <w:sz w:val="24"/>
+          <w:szCs w:val="24"/>
+        </w:rPr>
+        <w:t>.</w:t>
+      </w:r>
+    </w:p>
+    <w:p>
+      <w:pPr>
+        <w:numPr>
+          <w:ilvl w:val="1"/>
+          <w:numId w:val="13"/>
+        </w:numPr>
+        <w:pBdr>
+          <w:top w:val="nil"/>
+          <w:left w:val="nil"/>
+          <w:bottom w:val="nil"/>
+          <w:right w:val="nil"/>
+          <w:between w:val="nil"/>
+        </w:pBdr>
+        <w:spacing w:line="360" w:lineRule="auto"/>
+        <w:jc w:val="both"/>
+        <w:rPr>
+          <w:sz w:val="24"/>
+          <w:szCs w:val="24"/>
+        </w:rPr>
+      </w:pPr>
+      <w:r>
+        <w:rPr>
+          <w:sz w:val="24"/>
+          <w:szCs w:val="24"/>
+        </w:rPr>
+        <w:t xml:space="preserve">Identificato il codice del tecnico idoneo, il sistema interroga </w:t>
+      </w:r>
+      <w:proofErr w:type="spellStart"/>
+      <w:r>
+        <w:rPr>
+          <w:sz w:val="24"/>
+          <w:szCs w:val="24"/>
+        </w:rPr>
+        <w:t>alberoTecnici.c</w:t>
+      </w:r>
+      <w:proofErr w:type="spellEnd"/>
+      <w:r>
+        <w:rPr>
+          <w:sz w:val="24"/>
+          <w:szCs w:val="24"/>
+        </w:rPr>
+        <w:t xml:space="preserve"> per individuare il nodo corrispondente nel BST dei manutentori.</w:t>
+      </w:r>
+    </w:p>
+    <w:p>
+      <w:pPr>
+        <w:numPr>
+          <w:ilvl w:val="1"/>
+          <w:numId w:val="13"/>
+        </w:numPr>
+        <w:pBdr>
+          <w:top w:val="nil"/>
+          <w:left w:val="nil"/>
+          <w:bottom w:val="nil"/>
+          <w:right w:val="nil"/>
+          <w:between w:val="nil"/>
+        </w:pBdr>
+        <w:spacing w:line="360" w:lineRule="auto"/>
+        <w:jc w:val="both"/>
+        <w:rPr>
+          <w:sz w:val="24"/>
+          <w:szCs w:val="24"/>
+        </w:rPr>
+      </w:pPr>
+      <w:r>
+        <w:rPr>
+          <w:sz w:val="24"/>
+          <w:szCs w:val="24"/>
+        </w:rPr>
+        <w:t xml:space="preserve">Una volta estratto il profilo del tecnico, il controllo passa al modulo </w:t>
+      </w:r>
+      <w:proofErr w:type="spellStart"/>
+      <w:r>
+        <w:rPr>
+          <w:sz w:val="24"/>
+          <w:szCs w:val="24"/>
+        </w:rPr>
+        <w:t>agendaTecnico.c</w:t>
+      </w:r>
+      <w:proofErr w:type="spellEnd"/>
+      <w:r>
+        <w:rPr>
+          <w:sz w:val="24"/>
+          <w:szCs w:val="24"/>
+        </w:rPr>
+        <w:t xml:space="preserve">. Il </w:t>
+      </w:r>
+      <w:proofErr w:type="gramStart"/>
+      <w:r>
+        <w:rPr>
+          <w:sz w:val="24"/>
+          <w:szCs w:val="24"/>
+        </w:rPr>
+        <w:t>sotto-albero</w:t>
+      </w:r>
+      <w:proofErr w:type="gramEnd"/>
+      <w:r>
+        <w:rPr>
+          <w:sz w:val="24"/>
+          <w:szCs w:val="24"/>
+        </w:rPr>
+        <w:t xml:space="preserve"> integrato nel tecnico viene attraversato per verificare che la data e la fascia oraria dell'intervento non si sovrappongano con impegni pregressi.</w:t>
+      </w:r>
+    </w:p>
+    <w:p>
+      <w:pPr>
+        <w:numPr>
+          <w:ilvl w:val="1"/>
+          <w:numId w:val="13"/>
+        </w:numPr>
+        <w:pBdr>
+          <w:top w:val="nil"/>
+          <w:left w:val="nil"/>
+          <w:bottom w:val="nil"/>
+          <w:right w:val="nil"/>
+          <w:between w:val="nil"/>
+        </w:pBdr>
+        <w:spacing w:line="360" w:lineRule="auto"/>
+        <w:jc w:val="both"/>
+        <w:rPr>
+          <w:sz w:val="24"/>
+          <w:szCs w:val="24"/>
+        </w:rPr>
+      </w:pPr>
+      <w:r>
+        <w:rPr>
+          <w:sz w:val="24"/>
+          <w:szCs w:val="24"/>
+        </w:rPr>
+        <w:t xml:space="preserve">In assenza di conflitti orari, l'appuntamento viene validato e inserito stabilmente nell'agenda del tecnico; contestualmente, lo stato dell'entità in </w:t>
+      </w:r>
+      <w:proofErr w:type="spellStart"/>
+      <w:r>
+        <w:rPr>
+          <w:sz w:val="24"/>
+          <w:szCs w:val="24"/>
+        </w:rPr>
+        <w:t>richiesta.c</w:t>
+      </w:r>
+      <w:proofErr w:type="spellEnd"/>
+      <w:r>
+        <w:rPr>
+          <w:sz w:val="24"/>
+          <w:szCs w:val="24"/>
+        </w:rPr>
+        <w:t xml:space="preserve"> transita da APERTA ad ASSEGNATA.</w:t>
+      </w:r>
+    </w:p>
+    <w:p>
+      <w:pPr>
+        <w:numPr>
+          <w:ilvl w:val="0"/>
+          <w:numId w:val="12"/>
+        </w:numPr>
+        <w:pBdr>
+          <w:top w:val="nil"/>
+          <w:left w:val="nil"/>
+          <w:bottom w:val="nil"/>
+          <w:right w:val="nil"/>
+          <w:between w:val="nil"/>
+        </w:pBdr>
+        <w:spacing w:line="360" w:lineRule="auto"/>
+        <w:jc w:val="both"/>
+        <w:rPr>
+          <w:sz w:val="24"/>
+          <w:szCs w:val="24"/>
+        </w:rPr>
+      </w:pPr>
+      <w:r>
+        <w:rPr>
+          <w:b/>
+          <w:bCs/>
+          <w:sz w:val="24"/>
+          <w:szCs w:val="24"/>
+        </w:rPr>
+        <w:t>Flusso di Rimozione Logica</w:t>
+      </w:r>
+      <w:r>
+        <w:rPr>
+          <w:sz w:val="24"/>
+          <w:szCs w:val="24"/>
+        </w:rPr>
+        <w:t>:</w:t>
+      </w:r>
+    </w:p>
+    <w:p>
+      <w:pPr>
+        <w:pBdr>
+          <w:top w:val="nil"/>
+          <w:left w:val="nil"/>
+          <w:bottom w:val="nil"/>
+          <w:right w:val="nil"/>
+          <w:between w:val="nil"/>
+        </w:pBdr>
+        <w:spacing w:line="360" w:lineRule="auto"/>
+        <w:jc w:val="both"/>
+        <w:rPr>
+          <w:sz w:val="24"/>
+          <w:szCs w:val="24"/>
+        </w:rPr>
+      </w:pPr>
+      <w:r>
+        <w:rPr>
+          <w:sz w:val="24"/>
+          <w:szCs w:val="24"/>
+        </w:rPr>
+        <w:t xml:space="preserve">Per evitare costose operazioni di ristrutturazione immediata delle strutture dati durante la rimozione o la modifica di priorità, i moduli </w:t>
+      </w:r>
+      <w:proofErr w:type="spellStart"/>
+      <w:r>
+        <w:rPr>
+          <w:sz w:val="24"/>
+          <w:szCs w:val="24"/>
+        </w:rPr>
+        <w:t>richiesta.c</w:t>
+      </w:r>
+      <w:proofErr w:type="spellEnd"/>
+      <w:r>
+        <w:rPr>
+          <w:sz w:val="24"/>
+          <w:szCs w:val="24"/>
+        </w:rPr>
+        <w:t xml:space="preserve"> e </w:t>
+      </w:r>
+      <w:proofErr w:type="spellStart"/>
+      <w:r>
+        <w:rPr>
+          <w:sz w:val="24"/>
+          <w:szCs w:val="24"/>
+        </w:rPr>
+        <w:t>codaPriorita.c</w:t>
+      </w:r>
+      <w:proofErr w:type="spellEnd"/>
+      <w:r>
+        <w:rPr>
+          <w:sz w:val="24"/>
+          <w:szCs w:val="24"/>
+        </w:rPr>
+        <w:t xml:space="preserve"> interagiscono mediante un flag logico (</w:t>
+      </w:r>
+      <w:proofErr w:type="spellStart"/>
+      <w:r>
+        <w:rPr>
+          <w:sz w:val="24"/>
+          <w:szCs w:val="24"/>
+        </w:rPr>
+        <w:t>isValidaInHeap</w:t>
+      </w:r>
+      <w:proofErr w:type="spellEnd"/>
+      <w:r>
+        <w:rPr>
+          <w:sz w:val="24"/>
+          <w:szCs w:val="24"/>
+        </w:rPr>
+        <w:t xml:space="preserve">). Quando una richiesta viene processata o eliminata, il modulo </w:t>
+      </w:r>
+      <w:proofErr w:type="spellStart"/>
+      <w:r>
+        <w:rPr>
+          <w:sz w:val="24"/>
+          <w:szCs w:val="24"/>
+        </w:rPr>
+        <w:t>richiesta.c</w:t>
+      </w:r>
+      <w:proofErr w:type="spellEnd"/>
+      <w:r>
+        <w:rPr>
+          <w:sz w:val="24"/>
+          <w:szCs w:val="24"/>
+        </w:rPr>
+        <w:t xml:space="preserve"> invalida il flag. Durante le successive operazioni di estrazione della stringa di comando, il modulo </w:t>
+      </w:r>
+      <w:proofErr w:type="spellStart"/>
+      <w:r>
+        <w:rPr>
+          <w:sz w:val="24"/>
+          <w:szCs w:val="24"/>
+        </w:rPr>
+        <w:t>codaPriorita.c</w:t>
+      </w:r>
+      <w:proofErr w:type="spellEnd"/>
+      <w:r>
+        <w:rPr>
+          <w:sz w:val="24"/>
+          <w:szCs w:val="24"/>
+        </w:rPr>
+        <w:t xml:space="preserve"> interroga questo stato: se la richiesta è marcata come non valida, l'elemento viene scartato in tempo costante e l'Heap esegue il riallineamento solo sui nodi attivi, ottimizzando l'efficienza computazionale globale.</w:t>
+      </w:r>
+    </w:p>
+    <w:p>
+      <w:pPr>
+        <w:pBdr>
+          <w:top w:val="nil"/>
+          <w:left w:val="nil"/>
+          <w:bottom w:val="nil"/>
+          <w:right w:val="nil"/>
+          <w:between w:val="nil"/>
+        </w:pBdr>
+        <w:spacing w:line="360" w:lineRule="auto"/>
+        <w:jc w:val="both"/>
+      </w:pPr>
+    </w:p>
+    <w:p>
+      <w:pPr>
+        <w:pBdr>
+          <w:top w:val="nil"/>
+          <w:left w:val="nil"/>
+          <w:bottom w:val="nil"/>
+          <w:right w:val="nil"/>
+          <w:between w:val="nil"/>
+        </w:pBdr>
+        <w:spacing w:line="360" w:lineRule="auto"/>
+        <w:jc w:val="both"/>
+      </w:pPr>
+    </w:p>
+    <w:p>
+      <w:pPr>
+        <w:pStyle w:val="Titolo2"/>
+      </w:pPr>
+      <w:r>
+        <w:lastRenderedPageBreak/>
+        <w:t xml:space="preserve">4. </w:t>
+      </w:r>
+      <w:r>
+        <w:t xml:space="preserve">Come usare e </w:t>
+      </w:r>
+      <w:r>
+        <w:t>inte</w:t>
+      </w:r>
+      <w:r>
+        <w:t>ragire con il sistema</w:t>
+      </w:r>
+    </w:p>
+    <w:p>
+      <w:pPr>
+        <w:spacing w:line="360" w:lineRule="auto"/>
+        <w:jc w:val="both"/>
+        <w:rPr>
+          <w:b/>
+          <w:bCs/>
+          <w:sz w:val="24"/>
+          <w:szCs w:val="24"/>
+        </w:rPr>
+      </w:pPr>
+      <w:r>
+        <w:rPr>
+          <w:sz w:val="24"/>
+          <w:szCs w:val="24"/>
+        </w:rPr>
+        <w:t>Il sistema è stato concepito per offrire un'esperienza utente fluida attraverso un'interfaccia a riga di comando. L'interazione è guidata da un menu testuale interattivo che nasconde la complessità delle strutture dati sottostanti, permettendo all'amministratore del condominio di gestire le operazioni in modo semplice e intuitivo.</w:t>
+      </w:r>
+    </w:p>
+    <w:p>
+      <w:pPr>
+        <w:pBdr>
+          <w:top w:val="nil"/>
+          <w:left w:val="nil"/>
+          <w:bottom w:val="nil"/>
+          <w:right w:val="nil"/>
+          <w:between w:val="nil"/>
+        </w:pBdr>
+        <w:spacing w:line="360" w:lineRule="auto"/>
+        <w:jc w:val="both"/>
+        <w:rPr>
+          <w:sz w:val="24"/>
+          <w:szCs w:val="24"/>
+        </w:rPr>
+      </w:pPr>
+      <w:r>
+        <w:rPr>
+          <w:sz w:val="24"/>
+          <w:szCs w:val="24"/>
+        </w:rPr>
+        <w:t>Di seguito sono descritte le fasi principali per l'utilizzo del software:</w:t>
+      </w:r>
+    </w:p>
+    <w:p>
+      <w:pPr>
+        <w:numPr>
+          <w:ilvl w:val="0"/>
+          <w:numId w:val="14"/>
+        </w:numPr>
+        <w:pBdr>
+          <w:top w:val="nil"/>
+          <w:left w:val="nil"/>
+          <w:bottom w:val="nil"/>
+          <w:right w:val="nil"/>
+          <w:between w:val="nil"/>
+        </w:pBdr>
+        <w:spacing w:line="360" w:lineRule="auto"/>
+        <w:jc w:val="both"/>
+        <w:rPr>
+          <w:sz w:val="24"/>
+          <w:szCs w:val="24"/>
+        </w:rPr>
+      </w:pPr>
+      <w:r>
+        <w:rPr>
+          <w:sz w:val="24"/>
+          <w:szCs w:val="24"/>
+        </w:rPr>
+        <w:t>Compilazione e avvio dell'applicazione</w:t>
+      </w:r>
+    </w:p>
+    <w:p>
+      <w:pPr>
+        <w:numPr>
+          <w:ilvl w:val="1"/>
+          <w:numId w:val="14"/>
+        </w:numPr>
+        <w:pBdr>
+          <w:top w:val="nil"/>
+          <w:left w:val="nil"/>
+          <w:bottom w:val="nil"/>
+          <w:right w:val="nil"/>
+          <w:between w:val="nil"/>
+        </w:pBdr>
+        <w:spacing w:line="360" w:lineRule="auto"/>
+        <w:jc w:val="both"/>
+        <w:rPr>
+          <w:sz w:val="24"/>
+          <w:szCs w:val="24"/>
+        </w:rPr>
+      </w:pPr>
+      <w:r>
+        <w:rPr>
+          <w:sz w:val="24"/>
+          <w:szCs w:val="24"/>
+        </w:rPr>
+        <w:t xml:space="preserve">Il progetto è predisposto per la compilazione automatica tramite </w:t>
+      </w:r>
+      <w:proofErr w:type="spellStart"/>
+      <w:r>
+        <w:rPr>
+          <w:sz w:val="24"/>
+          <w:szCs w:val="24"/>
+        </w:rPr>
+        <w:t>Makefile</w:t>
+      </w:r>
+      <w:proofErr w:type="spellEnd"/>
+      <w:r>
+        <w:rPr>
+          <w:sz w:val="24"/>
+          <w:szCs w:val="24"/>
+        </w:rPr>
+        <w:t>. È sufficiente aprire il terminale nella cartella del progetto e digitare il comando make per generare il programma eseguibile.</w:t>
+      </w:r>
+    </w:p>
+    <w:p>
+      <w:pPr>
+        <w:numPr>
+          <w:ilvl w:val="1"/>
+          <w:numId w:val="14"/>
+        </w:numPr>
+        <w:pBdr>
+          <w:top w:val="nil"/>
+          <w:left w:val="nil"/>
+          <w:bottom w:val="nil"/>
+          <w:right w:val="nil"/>
+          <w:between w:val="nil"/>
+        </w:pBdr>
+        <w:spacing w:line="360" w:lineRule="auto"/>
+        <w:jc w:val="both"/>
+        <w:rPr>
+          <w:sz w:val="24"/>
+          <w:szCs w:val="24"/>
+        </w:rPr>
+      </w:pPr>
+      <w:r>
+        <w:rPr>
+          <w:sz w:val="24"/>
+          <w:szCs w:val="24"/>
+        </w:rPr>
+        <w:t>Una volta avviato l'eseguibile, il sistema prepara automaticamente la memoria necessaria per le strutture dati e mostra la schermata iniziale.</w:t>
+      </w:r>
+    </w:p>
+    <w:p>
+      <w:pPr>
+        <w:numPr>
+          <w:ilvl w:val="0"/>
+          <w:numId w:val="14"/>
+        </w:numPr>
+        <w:pBdr>
+          <w:top w:val="nil"/>
+          <w:left w:val="nil"/>
+          <w:bottom w:val="nil"/>
+          <w:right w:val="nil"/>
+          <w:between w:val="nil"/>
+        </w:pBdr>
+        <w:spacing w:line="360" w:lineRule="auto"/>
+        <w:jc w:val="both"/>
+        <w:rPr>
+          <w:sz w:val="24"/>
+          <w:szCs w:val="24"/>
+        </w:rPr>
+      </w:pPr>
+      <w:r>
+        <w:rPr>
+          <w:sz w:val="24"/>
+          <w:szCs w:val="24"/>
+        </w:rPr>
+        <w:t>Navigazione del menu principale</w:t>
+      </w:r>
+    </w:p>
+    <w:p>
+      <w:pPr>
+        <w:numPr>
+          <w:ilvl w:val="1"/>
+          <w:numId w:val="14"/>
+        </w:numPr>
+        <w:pBdr>
+          <w:top w:val="nil"/>
+          <w:left w:val="nil"/>
+          <w:bottom w:val="nil"/>
+          <w:right w:val="nil"/>
+          <w:between w:val="nil"/>
+        </w:pBdr>
+        <w:spacing w:line="360" w:lineRule="auto"/>
+        <w:jc w:val="both"/>
+        <w:rPr>
+          <w:sz w:val="24"/>
+          <w:szCs w:val="24"/>
+        </w:rPr>
+      </w:pPr>
+      <w:r>
+        <w:rPr>
+          <w:sz w:val="24"/>
+          <w:szCs w:val="24"/>
+        </w:rPr>
+        <w:t>L'interfaccia mostra un elenco numerato delle operazioni disponibili. L'utente deve semplicemente digitare il numero corrispondente all'azione voluta e premere Invio.</w:t>
+      </w:r>
+    </w:p>
+    <w:p>
+      <w:pPr>
+        <w:numPr>
+          <w:ilvl w:val="1"/>
+          <w:numId w:val="14"/>
+        </w:numPr>
+        <w:pBdr>
+          <w:top w:val="nil"/>
+          <w:left w:val="nil"/>
+          <w:bottom w:val="nil"/>
+          <w:right w:val="nil"/>
+          <w:between w:val="nil"/>
+        </w:pBdr>
+        <w:spacing w:line="360" w:lineRule="auto"/>
+        <w:jc w:val="both"/>
+        <w:rPr>
+          <w:sz w:val="24"/>
+          <w:szCs w:val="24"/>
+        </w:rPr>
+      </w:pPr>
+      <w:r>
+        <w:rPr>
+          <w:sz w:val="24"/>
+          <w:szCs w:val="24"/>
+        </w:rPr>
+        <w:t>Il programma include controlli di sicurezza sugli inserimenti: se per errore vengono digitate delle lettere al posto di numeri, il sistema riconosce l'errore e chiede di ripetere l'inserimento senza bloccarsi.</w:t>
+      </w:r>
+    </w:p>
+    <w:p>
+      <w:pPr>
+        <w:numPr>
+          <w:ilvl w:val="0"/>
+          <w:numId w:val="14"/>
+        </w:numPr>
+        <w:pBdr>
+          <w:top w:val="nil"/>
+          <w:left w:val="nil"/>
+          <w:bottom w:val="nil"/>
+          <w:right w:val="nil"/>
+          <w:between w:val="nil"/>
+        </w:pBdr>
+        <w:spacing w:line="360" w:lineRule="auto"/>
+        <w:jc w:val="both"/>
+        <w:rPr>
+          <w:sz w:val="24"/>
+          <w:szCs w:val="24"/>
+        </w:rPr>
+      </w:pPr>
+      <w:r>
+        <w:rPr>
+          <w:sz w:val="24"/>
+          <w:szCs w:val="24"/>
+        </w:rPr>
+        <w:t>Esecuzione delle operazioni di base</w:t>
+      </w:r>
+    </w:p>
+    <w:p>
+      <w:pPr>
+        <w:numPr>
+          <w:ilvl w:val="1"/>
+          <w:numId w:val="14"/>
+        </w:numPr>
+        <w:pBdr>
+          <w:top w:val="nil"/>
+          <w:left w:val="nil"/>
+          <w:bottom w:val="nil"/>
+          <w:right w:val="nil"/>
+          <w:between w:val="nil"/>
+        </w:pBdr>
+        <w:spacing w:line="360" w:lineRule="auto"/>
+        <w:jc w:val="both"/>
+        <w:rPr>
+          <w:sz w:val="24"/>
+          <w:szCs w:val="24"/>
+        </w:rPr>
+      </w:pPr>
+      <w:r>
+        <w:rPr>
+          <w:sz w:val="24"/>
+          <w:szCs w:val="24"/>
+        </w:rPr>
+        <w:t>Inserimento di una segnalazione: il sistema richiede passo dopo passo i dati del problema, come la descrizione, l'area interessata e l'urgenza. Il ticket viene salvato in automatico sia nell'archivio storico sia nella coda delle priorità.</w:t>
+      </w:r>
+    </w:p>
+    <w:p>
+      <w:pPr>
+        <w:numPr>
+          <w:ilvl w:val="1"/>
+          <w:numId w:val="14"/>
+        </w:numPr>
+        <w:pBdr>
+          <w:top w:val="nil"/>
+          <w:left w:val="nil"/>
+          <w:bottom w:val="nil"/>
+          <w:right w:val="nil"/>
+          <w:between w:val="nil"/>
+        </w:pBdr>
+        <w:spacing w:line="360" w:lineRule="auto"/>
+        <w:jc w:val="both"/>
+        <w:rPr>
+          <w:sz w:val="24"/>
+          <w:szCs w:val="24"/>
+        </w:rPr>
+      </w:pPr>
+      <w:r>
+        <w:rPr>
+          <w:sz w:val="24"/>
+          <w:szCs w:val="24"/>
+        </w:rPr>
+        <w:t>Gestione dei tecnici: l'utente può registrare un nuovo manutentore oppure visualizzare la lista di quelli esistenti. La lista viene mostrata sempre in perfetto ordine alfabetico per facilitare la ricerca a schermo.</w:t>
+      </w:r>
+    </w:p>
+    <w:p>
+      <w:pPr>
+        <w:numPr>
+          <w:ilvl w:val="1"/>
+          <w:numId w:val="14"/>
+        </w:numPr>
+        <w:pBdr>
+          <w:top w:val="nil"/>
+          <w:left w:val="nil"/>
+          <w:bottom w:val="nil"/>
+          <w:right w:val="nil"/>
+          <w:between w:val="nil"/>
+        </w:pBdr>
+        <w:spacing w:line="360" w:lineRule="auto"/>
+        <w:jc w:val="both"/>
+        <w:rPr>
+          <w:sz w:val="24"/>
+          <w:szCs w:val="24"/>
+        </w:rPr>
+      </w:pPr>
+      <w:r>
+        <w:rPr>
+          <w:sz w:val="24"/>
+          <w:szCs w:val="24"/>
+        </w:rPr>
+        <w:t xml:space="preserve">Assegnazione di un intervento: quando si sceglie di assegnare un lavoro, il sistema propone da solo la richiesta con l'urgenza più alta. L'utente deve solo indicare a quale tecnico affidarla e l'orario previsto. Il sistema controllerà l'agenda del manutentore: se è libero l'appuntamento viene </w:t>
+      </w:r>
+      <w:r>
+        <w:rPr>
+          <w:sz w:val="24"/>
+          <w:szCs w:val="24"/>
+        </w:rPr>
+        <w:lastRenderedPageBreak/>
+        <w:t>confermato, se invece è già occupato in quell'orario, l'operazione viene bloccata e viene richiesto un orario diverso.</w:t>
+      </w:r>
+    </w:p>
+    <w:p>
+      <w:pPr>
+        <w:numPr>
+          <w:ilvl w:val="1"/>
+          <w:numId w:val="14"/>
+        </w:numPr>
+        <w:pBdr>
+          <w:top w:val="nil"/>
+          <w:left w:val="nil"/>
+          <w:bottom w:val="nil"/>
+          <w:right w:val="nil"/>
+          <w:between w:val="nil"/>
+        </w:pBdr>
+        <w:spacing w:line="360" w:lineRule="auto"/>
+        <w:jc w:val="both"/>
+        <w:rPr>
+          <w:sz w:val="24"/>
+          <w:szCs w:val="24"/>
+        </w:rPr>
+      </w:pPr>
+      <w:r>
+        <w:rPr>
+          <w:sz w:val="24"/>
+          <w:szCs w:val="24"/>
+        </w:rPr>
+        <w:t>Consultazione e reportistica: è sempre possibile controllare gli impegni di un singolo tecnico, mostrati in ordine cronologico, oppure stampare un riepilogo generale per capire quante segnalazioni sono ancora aperte, assegnate o già concluse.</w:t>
+      </w:r>
+    </w:p>
+    <w:p>
+      <w:pPr>
+        <w:numPr>
+          <w:ilvl w:val="0"/>
+          <w:numId w:val="14"/>
+        </w:numPr>
+        <w:pBdr>
+          <w:top w:val="nil"/>
+          <w:left w:val="nil"/>
+          <w:bottom w:val="nil"/>
+          <w:right w:val="nil"/>
+          <w:between w:val="nil"/>
+        </w:pBdr>
+        <w:spacing w:line="360" w:lineRule="auto"/>
+        <w:jc w:val="both"/>
+        <w:rPr>
+          <w:sz w:val="24"/>
+          <w:szCs w:val="24"/>
+        </w:rPr>
+      </w:pPr>
+      <w:r>
+        <w:rPr>
+          <w:sz w:val="24"/>
+          <w:szCs w:val="24"/>
+        </w:rPr>
+        <w:t>Chiusura del sistema</w:t>
+      </w:r>
+    </w:p>
+    <w:p>
+      <w:pPr>
+        <w:numPr>
+          <w:ilvl w:val="1"/>
+          <w:numId w:val="14"/>
+        </w:numPr>
+        <w:pBdr>
+          <w:top w:val="nil"/>
+          <w:left w:val="nil"/>
+          <w:bottom w:val="nil"/>
+          <w:right w:val="nil"/>
+          <w:between w:val="nil"/>
+        </w:pBdr>
+        <w:spacing w:line="360" w:lineRule="auto"/>
+        <w:jc w:val="both"/>
+        <w:rPr>
+          <w:sz w:val="24"/>
+          <w:szCs w:val="24"/>
+        </w:rPr>
+      </w:pPr>
+      <w:r>
+        <w:rPr>
+          <w:sz w:val="24"/>
+          <w:szCs w:val="24"/>
+        </w:rPr>
+        <w:t>Selezionando l'opzione di uscita dal menu, il programma non si chiude bruscamente ma avvia una procedura di terminazione sicura. Tutta la memoria utilizzata per le code e gli alberi viene svuotata e restituita al computer, garantendo un'esecuzione pulita e senza sprechi di risorse.</w:t>
+      </w:r>
+    </w:p>
+    <w:p>
+      <w:pPr>
+        <w:pBdr>
+          <w:top w:val="nil"/>
+          <w:left w:val="nil"/>
+          <w:bottom w:val="nil"/>
+          <w:right w:val="nil"/>
+          <w:between w:val="nil"/>
+        </w:pBdr>
+        <w:spacing w:line="360" w:lineRule="auto"/>
+        <w:jc w:val="both"/>
+        <w:rPr>
+          <w:sz w:val="24"/>
+          <w:szCs w:val="24"/>
+        </w:rPr>
+      </w:pPr>
+    </w:p>
+    <w:p>
+      <w:pPr>
+        <w:pStyle w:val="Titolo2"/>
+      </w:pPr>
+      <w:r>
+        <w:t>5. Razionale dei Casi di Test</w:t>
+      </w:r>
+    </w:p>
+    <w:p>
+      <w:pPr>
+        <w:rPr>
+          <w:sz w:val="24"/>
+          <w:szCs w:val="24"/>
+        </w:rPr>
       </w:pPr>
       <w:r>
         <w:rPr>
@@ -640,20 +3225,27 @@
         <w:pStyle w:val="Titolo2"/>
       </w:pPr>
       <w:r>
-        <w:t>3. Progettazione e Architettura</w:t>
-      </w:r>
-    </w:p>
-    <w:p>
-      <w:pPr>
-        <w:pBdr>
-          <w:top w:val="nil"/>
-          <w:left w:val="nil"/>
-          <w:bottom w:val="nil"/>
-          <w:right w:val="nil"/>
-          <w:between w:val="nil"/>
-        </w:pBdr>
-        <w:spacing w:line="360" w:lineRule="auto"/>
-        <w:jc w:val="both"/>
+        <w:t xml:space="preserve">6. </w:t>
+      </w:r>
+      <w:r>
+        <w:t>Specifica Sintattica e Semantica</w:t>
+      </w:r>
+    </w:p>
+    <w:p>
+      <w:pPr>
+        <w:pBdr>
+          <w:top w:val="nil"/>
+          <w:left w:val="nil"/>
+          <w:bottom w:val="nil"/>
+          <w:right w:val="nil"/>
+          <w:between w:val="nil"/>
+        </w:pBdr>
+        <w:spacing w:line="360" w:lineRule="auto"/>
+        <w:jc w:val="both"/>
+        <w:rPr>
+          <w:sz w:val="24"/>
+          <w:szCs w:val="24"/>
+        </w:rPr>
       </w:pPr>
       <w:r>
         <w:rPr>
@@ -665,93 +3257,16 @@
     </w:p>
     <w:p>
       <w:pPr>
-        <w:pStyle w:val="Titolo2"/>
-      </w:pPr>
-      <w:r>
-        <w:t>4. Specifica Sintattica e Semantica</w:t>
-      </w:r>
-    </w:p>
-    <w:p>
-      <w:pPr>
-        <w:pBdr>
-          <w:top w:val="nil"/>
-          <w:left w:val="nil"/>
-          <w:bottom w:val="nil"/>
-          <w:right w:val="nil"/>
-          <w:between w:val="nil"/>
-        </w:pBdr>
-        <w:spacing w:line="360" w:lineRule="auto"/>
-        <w:jc w:val="both"/>
-        <w:rPr>
-          <w:sz w:val="24"/>
-          <w:szCs w:val="24"/>
-        </w:rPr>
-      </w:pPr>
-      <w:r>
-        <w:rPr>
-          <w:sz w:val="24"/>
-          <w:szCs w:val="24"/>
-        </w:rPr>
-        <w:t>D</w:t>
-      </w:r>
-      <w:r>
-        <w:rPr>
-          <w:sz w:val="24"/>
-          <w:szCs w:val="24"/>
-        </w:rPr>
-        <w:t>a fare!</w:t>
-      </w:r>
-    </w:p>
-    <w:p>
-      <w:pPr>
-        <w:pStyle w:val="Titolo2"/>
-      </w:pPr>
-      <w:r>
-        <w:t>5. Razionale dei Casi di Test</w:t>
-      </w:r>
-    </w:p>
-    <w:p>
-      <w:pPr>
-        <w:rPr>
-          <w:sz w:val="24"/>
-          <w:szCs w:val="24"/>
-        </w:rPr>
-      </w:pPr>
-      <w:r>
-        <w:rPr>
-          <w:sz w:val="24"/>
-          <w:szCs w:val="24"/>
-        </w:rPr>
-        <w:t>Da fare!</w:t>
-      </w:r>
-    </w:p>
-    <w:p>
-      <w:pPr>
-        <w:pStyle w:val="Titolo2"/>
-      </w:pPr>
-      <w:r>
-        <w:t>6. Come usare e interagire con il sistema</w:t>
-      </w:r>
-    </w:p>
-    <w:p>
-      <w:pPr>
-        <w:pBdr>
-          <w:top w:val="nil"/>
-          <w:left w:val="nil"/>
-          <w:bottom w:val="nil"/>
-          <w:right w:val="nil"/>
-          <w:between w:val="nil"/>
-        </w:pBdr>
-        <w:spacing w:line="360" w:lineRule="auto"/>
-        <w:jc w:val="both"/>
-      </w:pPr>
-      <w:r>
-        <w:rPr>
-          <w:sz w:val="24"/>
-          <w:szCs w:val="24"/>
-        </w:rPr>
-        <w:t>Da fare!</w:t>
-      </w:r>
+        <w:pBdr>
+          <w:top w:val="nil"/>
+          <w:left w:val="nil"/>
+          <w:bottom w:val="nil"/>
+          <w:right w:val="nil"/>
+          <w:between w:val="nil"/>
+        </w:pBdr>
+        <w:spacing w:line="360" w:lineRule="auto"/>
+        <w:jc w:val="both"/>
+      </w:pPr>
     </w:p>
     <w:sectPr>
       <w:pgSz w:w="12240" w:h="15840"/>
@@ -766,6 +3281,304 @@
 <file path=word/numbering.xml><?xml version="1.0" encoding="utf-8"?>
 <w:numbering xmlns:wpc="http://schemas.microsoft.com/office/word/2010/wordprocessingCanvas" xmlns:cx="http://schemas.microsoft.com/office/drawing/2014/chartex" xmlns:cx1="http://schemas.microsoft.com/office/drawing/2015/9/8/chartex" xmlns:cx2="http://schemas.microsoft.com/office/drawing/2015/10/21/chartex" xmlns:cx3="http://schemas.microsoft.com/office/drawing/2016/5/9/chartex" xmlns:cx4="http://schemas.microsoft.com/office/drawing/2016/5/10/chartex" xmlns:cx5="http://schemas.microsoft.com/office/drawing/2016/5/11/chartex" xmlns:cx6="http://schemas.microsoft.com/office/drawing/2016/5/12/chartex" xmlns:cx7="http://schemas.microsoft.com/office/drawing/2016/5/13/chartex" xmlns:cx8="http://schemas.microsoft.com/office/drawing/2016/5/14/chartex" xmlns:mc="http://schemas.openxmlformats.org/markup-compatibility/2006" xmlns:aink="http://schemas.microsoft.com/office/drawing/2016/ink" xmlns:am3d="http://schemas.microsoft.com/office/drawing/2017/model3d" xmlns:o="urn:schemas-microsoft-com:office:office" xmlns:oel="http://schemas.microsoft.com/office/2019/extlst" xmlns:r="http://schemas.openxmlformats.org/officeDocument/2006/relationships" xmlns:m="http://schemas.openxmlformats.org/officeDocument/2006/math" xmlns:v="urn:schemas-microsoft-com:vml" xmlns:wp14="http://schemas.microsoft.com/office/word/2010/wordprocessingDrawing" xmlns:wp="http://schemas.openxmlformats.org/drawingml/2006/wordprocessingDrawing" xmlns:w10="urn:schemas-microsoft-com:office:word" xmlns:w="http://schemas.openxmlformats.org/wordprocessingml/2006/main" xmlns:w14="http://schemas.microsoft.com/office/word/2010/wordml" xmlns:w15="http://schemas.microsoft.com/office/word/2012/wordml" xmlns:w16cex="http://schemas.microsoft.com/office/word/2018/wordml/cex" xmlns:w16cid="http://schemas.microsoft.com/office/word/2016/wordml/cid" xmlns:w16="http://schemas.microsoft.com/office/word/2018/wordml" xmlns:w16du="http://schemas.microsoft.com/office/word/2023/wordml/word16du" xmlns:w16sdtdh="http://schemas.microsoft.com/office/word/2020/wordml/sdtdatahash" xmlns:w16sdtfl="http://schemas.microsoft.com/office/word/2024/wordml/sdtformatlock" xmlns:w16se="http://schemas.microsoft.com/office/word/2015/wordml/symex" xmlns:wpg="http://schemas.microsoft.com/office/word/2010/wordprocessingGroup" xmlns:wpi="http://schemas.microsoft.com/office/word/2010/wordprocessingInk" xmlns:wne="http://schemas.microsoft.com/office/word/2006/wordml" xmlns:wps="http://schemas.microsoft.com/office/word/2010/wordprocessingShape" mc:Ignorable="w14 w15 w16se w16cid w16 w16cex w16sdtdh w16sdtfl w16du wp14">
   <w:abstractNum w:abstractNumId="0" w15:restartNumberingAfterBreak="0">
+    <w:nsid w:val="049B5A13"/>
+    <w:multiLevelType w:val="multilevel"/>
+    <w:tmpl w:val="9AAC3FAC"/>
+    <w:lvl w:ilvl="0">
+      <w:start w:val="1"/>
+      <w:numFmt w:val="bullet"/>
+      <w:lvlText w:val=""/>
+      <w:lvlJc w:val="left"/>
+      <w:pPr>
+        <w:tabs>
+          <w:tab w:val="num" w:pos="720"/>
+        </w:tabs>
+        <w:ind w:left="720" w:hanging="360"/>
+      </w:pPr>
+      <w:rPr>
+        <w:rFonts w:ascii="Symbol" w:hAnsi="Symbol" w:hint="default"/>
+        <w:sz w:val="20"/>
+      </w:rPr>
+    </w:lvl>
+    <w:lvl w:ilvl="1" w:tentative="1">
+      <w:start w:val="1"/>
+      <w:numFmt w:val="bullet"/>
+      <w:lvlText w:val="o"/>
+      <w:lvlJc w:val="left"/>
+      <w:pPr>
+        <w:tabs>
+          <w:tab w:val="num" w:pos="1440"/>
+        </w:tabs>
+        <w:ind w:left="1440" w:hanging="360"/>
+      </w:pPr>
+      <w:rPr>
+        <w:rFonts w:ascii="Courier New" w:hAnsi="Courier New" w:hint="default"/>
+        <w:sz w:val="20"/>
+      </w:rPr>
+    </w:lvl>
+    <w:lvl w:ilvl="2" w:tentative="1">
+      <w:start w:val="1"/>
+      <w:numFmt w:val="bullet"/>
+      <w:lvlText w:val=""/>
+      <w:lvlJc w:val="left"/>
+      <w:pPr>
+        <w:tabs>
+          <w:tab w:val="num" w:pos="2160"/>
+        </w:tabs>
+        <w:ind w:left="2160" w:hanging="360"/>
+      </w:pPr>
+      <w:rPr>
+        <w:rFonts w:ascii="Wingdings" w:hAnsi="Wingdings" w:hint="default"/>
+        <w:sz w:val="20"/>
+      </w:rPr>
+    </w:lvl>
+    <w:lvl w:ilvl="3" w:tentative="1">
+      <w:start w:val="1"/>
+      <w:numFmt w:val="bullet"/>
+      <w:lvlText w:val=""/>
+      <w:lvlJc w:val="left"/>
+      <w:pPr>
+        <w:tabs>
+          <w:tab w:val="num" w:pos="2880"/>
+        </w:tabs>
+        <w:ind w:left="2880" w:hanging="360"/>
+      </w:pPr>
+      <w:rPr>
+        <w:rFonts w:ascii="Wingdings" w:hAnsi="Wingdings" w:hint="default"/>
+        <w:sz w:val="20"/>
+      </w:rPr>
+    </w:lvl>
+    <w:lvl w:ilvl="4" w:tentative="1">
+      <w:start w:val="1"/>
+      <w:numFmt w:val="bullet"/>
+      <w:lvlText w:val=""/>
+      <w:lvlJc w:val="left"/>
+      <w:pPr>
+        <w:tabs>
+          <w:tab w:val="num" w:pos="3600"/>
+        </w:tabs>
+        <w:ind w:left="3600" w:hanging="360"/>
+      </w:pPr>
+      <w:rPr>
+        <w:rFonts w:ascii="Wingdings" w:hAnsi="Wingdings" w:hint="default"/>
+        <w:sz w:val="20"/>
+      </w:rPr>
+    </w:lvl>
+    <w:lvl w:ilvl="5" w:tentative="1">
+      <w:start w:val="1"/>
+      <w:numFmt w:val="bullet"/>
+      <w:lvlText w:val=""/>
+      <w:lvlJc w:val="left"/>
+      <w:pPr>
+        <w:tabs>
+          <w:tab w:val="num" w:pos="4320"/>
+        </w:tabs>
+        <w:ind w:left="4320" w:hanging="360"/>
+      </w:pPr>
+      <w:rPr>
+        <w:rFonts w:ascii="Wingdings" w:hAnsi="Wingdings" w:hint="default"/>
+        <w:sz w:val="20"/>
+      </w:rPr>
+    </w:lvl>
+    <w:lvl w:ilvl="6" w:tentative="1">
+      <w:start w:val="1"/>
+      <w:numFmt w:val="bullet"/>
+      <w:lvlText w:val=""/>
+      <w:lvlJc w:val="left"/>
+      <w:pPr>
+        <w:tabs>
+          <w:tab w:val="num" w:pos="5040"/>
+        </w:tabs>
+        <w:ind w:left="5040" w:hanging="360"/>
+      </w:pPr>
+      <w:rPr>
+        <w:rFonts w:ascii="Wingdings" w:hAnsi="Wingdings" w:hint="default"/>
+        <w:sz w:val="20"/>
+      </w:rPr>
+    </w:lvl>
+    <w:lvl w:ilvl="7" w:tentative="1">
+      <w:start w:val="1"/>
+      <w:numFmt w:val="bullet"/>
+      <w:lvlText w:val=""/>
+      <w:lvlJc w:val="left"/>
+      <w:pPr>
+        <w:tabs>
+          <w:tab w:val="num" w:pos="5760"/>
+        </w:tabs>
+        <w:ind w:left="5760" w:hanging="360"/>
+      </w:pPr>
+      <w:rPr>
+        <w:rFonts w:ascii="Wingdings" w:hAnsi="Wingdings" w:hint="default"/>
+        <w:sz w:val="20"/>
+      </w:rPr>
+    </w:lvl>
+    <w:lvl w:ilvl="8" w:tentative="1">
+      <w:start w:val="1"/>
+      <w:numFmt w:val="bullet"/>
+      <w:lvlText w:val=""/>
+      <w:lvlJc w:val="left"/>
+      <w:pPr>
+        <w:tabs>
+          <w:tab w:val="num" w:pos="6480"/>
+        </w:tabs>
+        <w:ind w:left="6480" w:hanging="360"/>
+      </w:pPr>
+      <w:rPr>
+        <w:rFonts w:ascii="Wingdings" w:hAnsi="Wingdings" w:hint="default"/>
+        <w:sz w:val="20"/>
+      </w:rPr>
+    </w:lvl>
+  </w:abstractNum>
+  <w:abstractNum w:abstractNumId="1" w15:restartNumberingAfterBreak="0">
+    <w:nsid w:val="06BA45AE"/>
+    <w:multiLevelType w:val="multilevel"/>
+    <w:tmpl w:val="E430C372"/>
+    <w:lvl w:ilvl="0">
+      <w:start w:val="1"/>
+      <w:numFmt w:val="bullet"/>
+      <w:lvlText w:val=""/>
+      <w:lvlJc w:val="left"/>
+      <w:pPr>
+        <w:tabs>
+          <w:tab w:val="num" w:pos="720"/>
+        </w:tabs>
+        <w:ind w:left="720" w:hanging="360"/>
+      </w:pPr>
+      <w:rPr>
+        <w:rFonts w:ascii="Symbol" w:hAnsi="Symbol" w:hint="default"/>
+        <w:sz w:val="20"/>
+      </w:rPr>
+    </w:lvl>
+    <w:lvl w:ilvl="1">
+      <w:start w:val="1"/>
+      <w:numFmt w:val="bullet"/>
+      <w:lvlText w:val="o"/>
+      <w:lvlJc w:val="left"/>
+      <w:pPr>
+        <w:tabs>
+          <w:tab w:val="num" w:pos="1440"/>
+        </w:tabs>
+        <w:ind w:left="1440" w:hanging="360"/>
+      </w:pPr>
+      <w:rPr>
+        <w:rFonts w:ascii="Courier New" w:hAnsi="Courier New" w:hint="default"/>
+        <w:sz w:val="20"/>
+      </w:rPr>
+    </w:lvl>
+    <w:lvl w:ilvl="2" w:tentative="1">
+      <w:start w:val="1"/>
+      <w:numFmt w:val="bullet"/>
+      <w:lvlText w:val=""/>
+      <w:lvlJc w:val="left"/>
+      <w:pPr>
+        <w:tabs>
+          <w:tab w:val="num" w:pos="2160"/>
+        </w:tabs>
+        <w:ind w:left="2160" w:hanging="360"/>
+      </w:pPr>
+      <w:rPr>
+        <w:rFonts w:ascii="Wingdings" w:hAnsi="Wingdings" w:hint="default"/>
+        <w:sz w:val="20"/>
+      </w:rPr>
+    </w:lvl>
+    <w:lvl w:ilvl="3" w:tentative="1">
+      <w:start w:val="1"/>
+      <w:numFmt w:val="bullet"/>
+      <w:lvlText w:val=""/>
+      <w:lvlJc w:val="left"/>
+      <w:pPr>
+        <w:tabs>
+          <w:tab w:val="num" w:pos="2880"/>
+        </w:tabs>
+        <w:ind w:left="2880" w:hanging="360"/>
+      </w:pPr>
+      <w:rPr>
+        <w:rFonts w:ascii="Wingdings" w:hAnsi="Wingdings" w:hint="default"/>
+        <w:sz w:val="20"/>
+      </w:rPr>
+    </w:lvl>
+    <w:lvl w:ilvl="4" w:tentative="1">
+      <w:start w:val="1"/>
+      <w:numFmt w:val="bullet"/>
+      <w:lvlText w:val=""/>
+      <w:lvlJc w:val="left"/>
+      <w:pPr>
+        <w:tabs>
+          <w:tab w:val="num" w:pos="3600"/>
+        </w:tabs>
+        <w:ind w:left="3600" w:hanging="360"/>
+      </w:pPr>
+      <w:rPr>
+        <w:rFonts w:ascii="Wingdings" w:hAnsi="Wingdings" w:hint="default"/>
+        <w:sz w:val="20"/>
+      </w:rPr>
+    </w:lvl>
+    <w:lvl w:ilvl="5" w:tentative="1">
+      <w:start w:val="1"/>
+      <w:numFmt w:val="bullet"/>
+      <w:lvlText w:val=""/>
+      <w:lvlJc w:val="left"/>
+      <w:pPr>
+        <w:tabs>
+          <w:tab w:val="num" w:pos="4320"/>
+        </w:tabs>
+        <w:ind w:left="4320" w:hanging="360"/>
+      </w:pPr>
+      <w:rPr>
+        <w:rFonts w:ascii="Wingdings" w:hAnsi="Wingdings" w:hint="default"/>
+        <w:sz w:val="20"/>
+      </w:rPr>
+    </w:lvl>
+    <w:lvl w:ilvl="6" w:tentative="1">
+      <w:start w:val="1"/>
+      <w:numFmt w:val="bullet"/>
+      <w:lvlText w:val=""/>
+      <w:lvlJc w:val="left"/>
+      <w:pPr>
+        <w:tabs>
+          <w:tab w:val="num" w:pos="5040"/>
+        </w:tabs>
+        <w:ind w:left="5040" w:hanging="360"/>
+      </w:pPr>
+      <w:rPr>
+        <w:rFonts w:ascii="Wingdings" w:hAnsi="Wingdings" w:hint="default"/>
+        <w:sz w:val="20"/>
+      </w:rPr>
+    </w:lvl>
+    <w:lvl w:ilvl="7" w:tentative="1">
+      <w:start w:val="1"/>
+      <w:numFmt w:val="bullet"/>
+      <w:lvlText w:val=""/>
+      <w:lvlJc w:val="left"/>
+      <w:pPr>
+        <w:tabs>
+          <w:tab w:val="num" w:pos="5760"/>
+        </w:tabs>
+        <w:ind w:left="5760" w:hanging="360"/>
+      </w:pPr>
+      <w:rPr>
+        <w:rFonts w:ascii="Wingdings" w:hAnsi="Wingdings" w:hint="default"/>
+        <w:sz w:val="20"/>
+      </w:rPr>
+    </w:lvl>
+    <w:lvl w:ilvl="8" w:tentative="1">
+      <w:start w:val="1"/>
+      <w:numFmt w:val="bullet"/>
+      <w:lvlText w:val=""/>
+      <w:lvlJc w:val="left"/>
+      <w:pPr>
+        <w:tabs>
+          <w:tab w:val="num" w:pos="6480"/>
+        </w:tabs>
+        <w:ind w:left="6480" w:hanging="360"/>
+      </w:pPr>
+      <w:rPr>
+        <w:rFonts w:ascii="Wingdings" w:hAnsi="Wingdings" w:hint="default"/>
+        <w:sz w:val="20"/>
+      </w:rPr>
+    </w:lvl>
+  </w:abstractNum>
+  <w:abstractNum w:abstractNumId="2" w15:restartNumberingAfterBreak="0">
     <w:nsid w:val="12463F2E"/>
     <w:multiLevelType w:val="multilevel"/>
     <w:tmpl w:val="1F86C386"/>
@@ -914,7 +3727,269 @@
       </w:rPr>
     </w:lvl>
   </w:abstractNum>
-  <w:abstractNum w:abstractNumId="1" w15:restartNumberingAfterBreak="0">
+  <w:abstractNum w:abstractNumId="3" w15:restartNumberingAfterBreak="0">
+    <w:nsid w:val="170545FA"/>
+    <w:multiLevelType w:val="multilevel"/>
+    <w:tmpl w:val="7A7C50AC"/>
+    <w:lvl w:ilvl="0">
+      <w:start w:val="1"/>
+      <w:numFmt w:val="bullet"/>
+      <w:lvlText w:val=""/>
+      <w:lvlJc w:val="left"/>
+      <w:pPr>
+        <w:tabs>
+          <w:tab w:val="num" w:pos="720"/>
+        </w:tabs>
+        <w:ind w:left="720" w:hanging="360"/>
+      </w:pPr>
+      <w:rPr>
+        <w:rFonts w:ascii="Symbol" w:hAnsi="Symbol" w:hint="default"/>
+        <w:sz w:val="20"/>
+      </w:rPr>
+    </w:lvl>
+    <w:lvl w:ilvl="1" w:tentative="1">
+      <w:start w:val="1"/>
+      <w:numFmt w:val="bullet"/>
+      <w:lvlText w:val="o"/>
+      <w:lvlJc w:val="left"/>
+      <w:pPr>
+        <w:tabs>
+          <w:tab w:val="num" w:pos="1440"/>
+        </w:tabs>
+        <w:ind w:left="1440" w:hanging="360"/>
+      </w:pPr>
+      <w:rPr>
+        <w:rFonts w:ascii="Courier New" w:hAnsi="Courier New" w:hint="default"/>
+        <w:sz w:val="20"/>
+      </w:rPr>
+    </w:lvl>
+    <w:lvl w:ilvl="2" w:tentative="1">
+      <w:start w:val="1"/>
+      <w:numFmt w:val="bullet"/>
+      <w:lvlText w:val=""/>
+      <w:lvlJc w:val="left"/>
+      <w:pPr>
+        <w:tabs>
+          <w:tab w:val="num" w:pos="2160"/>
+        </w:tabs>
+        <w:ind w:left="2160" w:hanging="360"/>
+      </w:pPr>
+      <w:rPr>
+        <w:rFonts w:ascii="Wingdings" w:hAnsi="Wingdings" w:hint="default"/>
+        <w:sz w:val="20"/>
+      </w:rPr>
+    </w:lvl>
+    <w:lvl w:ilvl="3" w:tentative="1">
+      <w:start w:val="1"/>
+      <w:numFmt w:val="bullet"/>
+      <w:lvlText w:val=""/>
+      <w:lvlJc w:val="left"/>
+      <w:pPr>
+        <w:tabs>
+          <w:tab w:val="num" w:pos="2880"/>
+        </w:tabs>
+        <w:ind w:left="2880" w:hanging="360"/>
+      </w:pPr>
+      <w:rPr>
+        <w:rFonts w:ascii="Wingdings" w:hAnsi="Wingdings" w:hint="default"/>
+        <w:sz w:val="20"/>
+      </w:rPr>
+    </w:lvl>
+    <w:lvl w:ilvl="4" w:tentative="1">
+      <w:start w:val="1"/>
+      <w:numFmt w:val="bullet"/>
+      <w:lvlText w:val=""/>
+      <w:lvlJc w:val="left"/>
+      <w:pPr>
+        <w:tabs>
+          <w:tab w:val="num" w:pos="3600"/>
+        </w:tabs>
+        <w:ind w:left="3600" w:hanging="360"/>
+      </w:pPr>
+      <w:rPr>
+        <w:rFonts w:ascii="Wingdings" w:hAnsi="Wingdings" w:hint="default"/>
+        <w:sz w:val="20"/>
+      </w:rPr>
+    </w:lvl>
+    <w:lvl w:ilvl="5" w:tentative="1">
+      <w:start w:val="1"/>
+      <w:numFmt w:val="bullet"/>
+      <w:lvlText w:val=""/>
+      <w:lvlJc w:val="left"/>
+      <w:pPr>
+        <w:tabs>
+          <w:tab w:val="num" w:pos="4320"/>
+        </w:tabs>
+        <w:ind w:left="4320" w:hanging="360"/>
+      </w:pPr>
+      <w:rPr>
+        <w:rFonts w:ascii="Wingdings" w:hAnsi="Wingdings" w:hint="default"/>
+        <w:sz w:val="20"/>
+      </w:rPr>
+    </w:lvl>
+    <w:lvl w:ilvl="6" w:tentative="1">
+      <w:start w:val="1"/>
+      <w:numFmt w:val="bullet"/>
+      <w:lvlText w:val=""/>
+      <w:lvlJc w:val="left"/>
+      <w:pPr>
+        <w:tabs>
+          <w:tab w:val="num" w:pos="5040"/>
+        </w:tabs>
+        <w:ind w:left="5040" w:hanging="360"/>
+      </w:pPr>
+      <w:rPr>
+        <w:rFonts w:ascii="Wingdings" w:hAnsi="Wingdings" w:hint="default"/>
+        <w:sz w:val="20"/>
+      </w:rPr>
+    </w:lvl>
+    <w:lvl w:ilvl="7" w:tentative="1">
+      <w:start w:val="1"/>
+      <w:numFmt w:val="bullet"/>
+      <w:lvlText w:val=""/>
+      <w:lvlJc w:val="left"/>
+      <w:pPr>
+        <w:tabs>
+          <w:tab w:val="num" w:pos="5760"/>
+        </w:tabs>
+        <w:ind w:left="5760" w:hanging="360"/>
+      </w:pPr>
+      <w:rPr>
+        <w:rFonts w:ascii="Wingdings" w:hAnsi="Wingdings" w:hint="default"/>
+        <w:sz w:val="20"/>
+      </w:rPr>
+    </w:lvl>
+    <w:lvl w:ilvl="8" w:tentative="1">
+      <w:start w:val="1"/>
+      <w:numFmt w:val="bullet"/>
+      <w:lvlText w:val=""/>
+      <w:lvlJc w:val="left"/>
+      <w:pPr>
+        <w:tabs>
+          <w:tab w:val="num" w:pos="6480"/>
+        </w:tabs>
+        <w:ind w:left="6480" w:hanging="360"/>
+      </w:pPr>
+      <w:rPr>
+        <w:rFonts w:ascii="Wingdings" w:hAnsi="Wingdings" w:hint="default"/>
+        <w:sz w:val="20"/>
+      </w:rPr>
+    </w:lvl>
+  </w:abstractNum>
+  <w:abstractNum w:abstractNumId="4" w15:restartNumberingAfterBreak="0">
+    <w:nsid w:val="244F1F2F"/>
+    <w:multiLevelType w:val="multilevel"/>
+    <w:tmpl w:val="F5509D26"/>
+    <w:lvl w:ilvl="0">
+      <w:start w:val="1"/>
+      <w:numFmt w:val="decimal"/>
+      <w:lvlText w:val="%1."/>
+      <w:lvlJc w:val="left"/>
+      <w:pPr>
+        <w:tabs>
+          <w:tab w:val="num" w:pos="720"/>
+        </w:tabs>
+        <w:ind w:left="720" w:hanging="360"/>
+      </w:pPr>
+    </w:lvl>
+    <w:lvl w:ilvl="1" w:tentative="1">
+      <w:start w:val="1"/>
+      <w:numFmt w:val="decimal"/>
+      <w:lvlText w:val="%2."/>
+      <w:lvlJc w:val="left"/>
+      <w:pPr>
+        <w:tabs>
+          <w:tab w:val="num" w:pos="1440"/>
+        </w:tabs>
+        <w:ind w:left="1440" w:hanging="360"/>
+      </w:pPr>
+    </w:lvl>
+    <w:lvl w:ilvl="2" w:tentative="1">
+      <w:start w:val="1"/>
+      <w:numFmt w:val="decimal"/>
+      <w:lvlText w:val="%3."/>
+      <w:lvlJc w:val="left"/>
+      <w:pPr>
+        <w:tabs>
+          <w:tab w:val="num" w:pos="2160"/>
+        </w:tabs>
+        <w:ind w:left="2160" w:hanging="360"/>
+      </w:pPr>
+    </w:lvl>
+    <w:lvl w:ilvl="3" w:tentative="1">
+      <w:start w:val="1"/>
+      <w:numFmt w:val="decimal"/>
+      <w:lvlText w:val="%4."/>
+      <w:lvlJc w:val="left"/>
+      <w:pPr>
+        <w:tabs>
+          <w:tab w:val="num" w:pos="2880"/>
+        </w:tabs>
+        <w:ind w:left="2880" w:hanging="360"/>
+      </w:pPr>
+    </w:lvl>
+    <w:lvl w:ilvl="4" w:tentative="1">
+      <w:start w:val="1"/>
+      <w:numFmt w:val="decimal"/>
+      <w:lvlText w:val="%5."/>
+      <w:lvlJc w:val="left"/>
+      <w:pPr>
+        <w:tabs>
+          <w:tab w:val="num" w:pos="3600"/>
+        </w:tabs>
+        <w:ind w:left="3600" w:hanging="360"/>
+      </w:pPr>
+    </w:lvl>
+    <w:lvl w:ilvl="5" w:tentative="1">
+      <w:start w:val="1"/>
+      <w:numFmt w:val="decimal"/>
+      <w:lvlText w:val="%6."/>
+      <w:lvlJc w:val="left"/>
+      <w:pPr>
+        <w:tabs>
+          <w:tab w:val="num" w:pos="4320"/>
+        </w:tabs>
+        <w:ind w:left="4320" w:hanging="360"/>
+      </w:pPr>
+    </w:lvl>
+    <w:lvl w:ilvl="6" w:tentative="1">
+      <w:start w:val="1"/>
+      <w:numFmt w:val="decimal"/>
+      <w:lvlText w:val="%7."/>
+      <w:lvlJc w:val="left"/>
+      <w:pPr>
+        <w:tabs>
+          <w:tab w:val="num" w:pos="5040"/>
+        </w:tabs>
+        <w:ind w:left="5040" w:hanging="360"/>
+      </w:pPr>
+    </w:lvl>
+    <w:lvl w:ilvl="7" w:tentative="1">
+      <w:start w:val="1"/>
+      <w:numFmt w:val="decimal"/>
+      <w:lvlText w:val="%8."/>
+      <w:lvlJc w:val="left"/>
+      <w:pPr>
+        <w:tabs>
+          <w:tab w:val="num" w:pos="5760"/>
+        </w:tabs>
+        <w:ind w:left="5760" w:hanging="360"/>
+      </w:pPr>
+    </w:lvl>
+    <w:lvl w:ilvl="8" w:tentative="1">
+      <w:start w:val="1"/>
+      <w:numFmt w:val="decimal"/>
+      <w:lvlText w:val="%9."/>
+      <w:lvlJc w:val="left"/>
+      <w:pPr>
+        <w:tabs>
+          <w:tab w:val="num" w:pos="6480"/>
+        </w:tabs>
+        <w:ind w:left="6480" w:hanging="360"/>
+      </w:pPr>
+    </w:lvl>
+  </w:abstractNum>
+  <w:abstractNum w:abstractNumId="5" w15:restartNumberingAfterBreak="0">
     <w:nsid w:val="24A327D6"/>
     <w:multiLevelType w:val="multilevel"/>
     <w:tmpl w:val="D9FC2F60"/>
@@ -1135,7 +4210,7 @@
       </w:rPr>
     </w:lvl>
   </w:abstractNum>
-  <w:abstractNum w:abstractNumId="2" w15:restartNumberingAfterBreak="0">
+  <w:abstractNum w:abstractNumId="6" w15:restartNumberingAfterBreak="0">
     <w:nsid w:val="321B057D"/>
     <w:multiLevelType w:val="multilevel"/>
     <w:tmpl w:val="787CC094"/>
@@ -1356,7 +4431,124 @@
       </w:rPr>
     </w:lvl>
   </w:abstractNum>
-  <w:abstractNum w:abstractNumId="3" w15:restartNumberingAfterBreak="0">
+  <w:abstractNum w:abstractNumId="7" w15:restartNumberingAfterBreak="0">
+    <w:nsid w:val="46DC260E"/>
+    <w:multiLevelType w:val="multilevel"/>
+    <w:tmpl w:val="56DA761C"/>
+    <w:lvl w:ilvl="0">
+      <w:start w:val="1"/>
+      <w:numFmt w:val="decimal"/>
+      <w:lvlText w:val="%1."/>
+      <w:lvlJc w:val="left"/>
+      <w:pPr>
+        <w:tabs>
+          <w:tab w:val="num" w:pos="720"/>
+        </w:tabs>
+        <w:ind w:left="720" w:hanging="360"/>
+      </w:pPr>
+    </w:lvl>
+    <w:lvl w:ilvl="1">
+      <w:start w:val="1"/>
+      <w:numFmt w:val="bullet"/>
+      <w:lvlText w:val="o"/>
+      <w:lvlJc w:val="left"/>
+      <w:pPr>
+        <w:tabs>
+          <w:tab w:val="num" w:pos="1440"/>
+        </w:tabs>
+        <w:ind w:left="1440" w:hanging="360"/>
+      </w:pPr>
+      <w:rPr>
+        <w:rFonts w:ascii="Courier New" w:hAnsi="Courier New" w:hint="default"/>
+        <w:sz w:val="20"/>
+      </w:rPr>
+    </w:lvl>
+    <w:lvl w:ilvl="2" w:tentative="1">
+      <w:start w:val="1"/>
+      <w:numFmt w:val="decimal"/>
+      <w:lvlText w:val="%3."/>
+      <w:lvlJc w:val="left"/>
+      <w:pPr>
+        <w:tabs>
+          <w:tab w:val="num" w:pos="2160"/>
+        </w:tabs>
+        <w:ind w:left="2160" w:hanging="360"/>
+      </w:pPr>
+    </w:lvl>
+    <w:lvl w:ilvl="3" w:tentative="1">
+      <w:start w:val="1"/>
+      <w:numFmt w:val="decimal"/>
+      <w:lvlText w:val="%4."/>
+      <w:lvlJc w:val="left"/>
+      <w:pPr>
+        <w:tabs>
+          <w:tab w:val="num" w:pos="2880"/>
+        </w:tabs>
+        <w:ind w:left="2880" w:hanging="360"/>
+      </w:pPr>
+    </w:lvl>
+    <w:lvl w:ilvl="4" w:tentative="1">
+      <w:start w:val="1"/>
+      <w:numFmt w:val="decimal"/>
+      <w:lvlText w:val="%5."/>
+      <w:lvlJc w:val="left"/>
+      <w:pPr>
+        <w:tabs>
+          <w:tab w:val="num" w:pos="3600"/>
+        </w:tabs>
+        <w:ind w:left="3600" w:hanging="360"/>
+      </w:pPr>
+    </w:lvl>
+    <w:lvl w:ilvl="5" w:tentative="1">
+      <w:start w:val="1"/>
+      <w:numFmt w:val="decimal"/>
+      <w:lvlText w:val="%6."/>
+      <w:lvlJc w:val="left"/>
+      <w:pPr>
+        <w:tabs>
+          <w:tab w:val="num" w:pos="4320"/>
+        </w:tabs>
+        <w:ind w:left="4320" w:hanging="360"/>
+      </w:pPr>
+    </w:lvl>
+    <w:lvl w:ilvl="6" w:tentative="1">
+      <w:start w:val="1"/>
+      <w:numFmt w:val="decimal"/>
+      <w:lvlText w:val="%7."/>
+      <w:lvlJc w:val="left"/>
+      <w:pPr>
+        <w:tabs>
+          <w:tab w:val="num" w:pos="5040"/>
+        </w:tabs>
+        <w:ind w:left="5040" w:hanging="360"/>
+      </w:pPr>
+    </w:lvl>
+    <w:lvl w:ilvl="7" w:tentative="1">
+      <w:start w:val="1"/>
+      <w:numFmt w:val="decimal"/>
+      <w:lvlText w:val="%8."/>
+      <w:lvlJc w:val="left"/>
+      <w:pPr>
+        <w:tabs>
+          <w:tab w:val="num" w:pos="5760"/>
+        </w:tabs>
+        <w:ind w:left="5760" w:hanging="360"/>
+      </w:pPr>
+    </w:lvl>
+    <w:lvl w:ilvl="8" w:tentative="1">
+      <w:start w:val="1"/>
+      <w:numFmt w:val="decimal"/>
+      <w:lvlText w:val="%9."/>
+      <w:lvlJc w:val="left"/>
+      <w:pPr>
+        <w:tabs>
+          <w:tab w:val="num" w:pos="6480"/>
+        </w:tabs>
+        <w:ind w:left="6480" w:hanging="360"/>
+      </w:pPr>
+    </w:lvl>
+  </w:abstractNum>
+  <w:abstractNum w:abstractNumId="8" w15:restartNumberingAfterBreak="0">
     <w:nsid w:val="5AEB345D"/>
     <w:multiLevelType w:val="multilevel"/>
     <w:tmpl w:val="1C62299C"/>
@@ -1505,7 +4697,156 @@
       </w:rPr>
     </w:lvl>
   </w:abstractNum>
-  <w:abstractNum w:abstractNumId="4" w15:restartNumberingAfterBreak="0">
+  <w:abstractNum w:abstractNumId="9" w15:restartNumberingAfterBreak="0">
+    <w:nsid w:val="5D7C1C76"/>
+    <w:multiLevelType w:val="multilevel"/>
+    <w:tmpl w:val="0C9C3AE2"/>
+    <w:lvl w:ilvl="0">
+      <w:start w:val="1"/>
+      <w:numFmt w:val="bullet"/>
+      <w:lvlText w:val=""/>
+      <w:lvlJc w:val="left"/>
+      <w:pPr>
+        <w:tabs>
+          <w:tab w:val="num" w:pos="720"/>
+        </w:tabs>
+        <w:ind w:left="720" w:hanging="360"/>
+      </w:pPr>
+      <w:rPr>
+        <w:rFonts w:ascii="Symbol" w:hAnsi="Symbol" w:hint="default"/>
+        <w:sz w:val="20"/>
+      </w:rPr>
+    </w:lvl>
+    <w:lvl w:ilvl="1" w:tentative="1">
+      <w:start w:val="1"/>
+      <w:numFmt w:val="bullet"/>
+      <w:lvlText w:val="o"/>
+      <w:lvlJc w:val="left"/>
+      <w:pPr>
+        <w:tabs>
+          <w:tab w:val="num" w:pos="1440"/>
+        </w:tabs>
+        <w:ind w:left="1440" w:hanging="360"/>
+      </w:pPr>
+      <w:rPr>
+        <w:rFonts w:ascii="Courier New" w:hAnsi="Courier New" w:hint="default"/>
+        <w:sz w:val="20"/>
+      </w:rPr>
+    </w:lvl>
+    <w:lvl w:ilvl="2" w:tentative="1">
+      <w:start w:val="1"/>
+      <w:numFmt w:val="bullet"/>
+      <w:lvlText w:val=""/>
+      <w:lvlJc w:val="left"/>
+      <w:pPr>
+        <w:tabs>
+          <w:tab w:val="num" w:pos="2160"/>
+        </w:tabs>
+        <w:ind w:left="2160" w:hanging="360"/>
+      </w:pPr>
+      <w:rPr>
+        <w:rFonts w:ascii="Wingdings" w:hAnsi="Wingdings" w:hint="default"/>
+        <w:sz w:val="20"/>
+      </w:rPr>
+    </w:lvl>
+    <w:lvl w:ilvl="3" w:tentative="1">
+      <w:start w:val="1"/>
+      <w:numFmt w:val="bullet"/>
+      <w:lvlText w:val=""/>
+      <w:lvlJc w:val="left"/>
+      <w:pPr>
+        <w:tabs>
+          <w:tab w:val="num" w:pos="2880"/>
+        </w:tabs>
+        <w:ind w:left="2880" w:hanging="360"/>
+      </w:pPr>
+      <w:rPr>
+        <w:rFonts w:ascii="Wingdings" w:hAnsi="Wingdings" w:hint="default"/>
+        <w:sz w:val="20"/>
+      </w:rPr>
+    </w:lvl>
+    <w:lvl w:ilvl="4" w:tentative="1">
+      <w:start w:val="1"/>
+      <w:numFmt w:val="bullet"/>
+      <w:lvlText w:val=""/>
+      <w:lvlJc w:val="left"/>
+      <w:pPr>
+        <w:tabs>
+          <w:tab w:val="num" w:pos="3600"/>
+        </w:tabs>
+        <w:ind w:left="3600" w:hanging="360"/>
+      </w:pPr>
+      <w:rPr>
+        <w:rFonts w:ascii="Wingdings" w:hAnsi="Wingdings" w:hint="default"/>
+        <w:sz w:val="20"/>
+      </w:rPr>
+    </w:lvl>
+    <w:lvl w:ilvl="5" w:tentative="1">
+      <w:start w:val="1"/>
+      <w:numFmt w:val="bullet"/>
+      <w:lvlText w:val=""/>
+      <w:lvlJc w:val="left"/>
+      <w:pPr>
+        <w:tabs>
+          <w:tab w:val="num" w:pos="4320"/>
+        </w:tabs>
+        <w:ind w:left="4320" w:hanging="360"/>
+      </w:pPr>
+      <w:rPr>
+        <w:rFonts w:ascii="Wingdings" w:hAnsi="Wingdings" w:hint="default"/>
+        <w:sz w:val="20"/>
+      </w:rPr>
+    </w:lvl>
+    <w:lvl w:ilvl="6" w:tentative="1">
+      <w:start w:val="1"/>
+      <w:numFmt w:val="bullet"/>
+      <w:lvlText w:val=""/>
+      <w:lvlJc w:val="left"/>
+      <w:pPr>
+        <w:tabs>
+          <w:tab w:val="num" w:pos="5040"/>
+        </w:tabs>
+        <w:ind w:left="5040" w:hanging="360"/>
+      </w:pPr>
+      <w:rPr>
+        <w:rFonts w:ascii="Wingdings" w:hAnsi="Wingdings" w:hint="default"/>
+        <w:sz w:val="20"/>
+      </w:rPr>
+    </w:lvl>
+    <w:lvl w:ilvl="7" w:tentative="1">
+      <w:start w:val="1"/>
+      <w:numFmt w:val="bullet"/>
+      <w:lvlText w:val=""/>
+      <w:lvlJc w:val="left"/>
+      <w:pPr>
+        <w:tabs>
+          <w:tab w:val="num" w:pos="5760"/>
+        </w:tabs>
+        <w:ind w:left="5760" w:hanging="360"/>
+      </w:pPr>
+      <w:rPr>
+        <w:rFonts w:ascii="Wingdings" w:hAnsi="Wingdings" w:hint="default"/>
+        <w:sz w:val="20"/>
+      </w:rPr>
+    </w:lvl>
+    <w:lvl w:ilvl="8" w:tentative="1">
+      <w:start w:val="1"/>
+      <w:numFmt w:val="bullet"/>
+      <w:lvlText w:val=""/>
+      <w:lvlJc w:val="left"/>
+      <w:pPr>
+        <w:tabs>
+          <w:tab w:val="num" w:pos="6480"/>
+        </w:tabs>
+        <w:ind w:left="6480" w:hanging="360"/>
+      </w:pPr>
+      <w:rPr>
+        <w:rFonts w:ascii="Wingdings" w:hAnsi="Wingdings" w:hint="default"/>
+        <w:sz w:val="20"/>
+      </w:rPr>
+    </w:lvl>
+  </w:abstractNum>
+  <w:abstractNum w:abstractNumId="10" w15:restartNumberingAfterBreak="0">
     <w:nsid w:val="6F2F2B8E"/>
     <w:multiLevelType w:val="multilevel"/>
     <w:tmpl w:val="21B44F58"/>
@@ -1726,7 +5067,7 @@
       </w:rPr>
     </w:lvl>
   </w:abstractNum>
-  <w:abstractNum w:abstractNumId="5" w15:restartNumberingAfterBreak="0">
+  <w:abstractNum w:abstractNumId="11" w15:restartNumberingAfterBreak="0">
     <w:nsid w:val="70FF35E0"/>
     <w:multiLevelType w:val="multilevel"/>
     <w:tmpl w:val="6602C904"/>
@@ -1947,23 +5288,341 @@
       </w:rPr>
     </w:lvl>
   </w:abstractNum>
+  <w:abstractNum w:abstractNumId="12" w15:restartNumberingAfterBreak="0">
+    <w:nsid w:val="767E1355"/>
+    <w:multiLevelType w:val="multilevel"/>
+    <w:tmpl w:val="AF3640F8"/>
+    <w:lvl w:ilvl="0">
+      <w:start w:val="1"/>
+      <w:numFmt w:val="bullet"/>
+      <w:lvlText w:val=""/>
+      <w:lvlJc w:val="left"/>
+      <w:pPr>
+        <w:tabs>
+          <w:tab w:val="num" w:pos="720"/>
+        </w:tabs>
+        <w:ind w:left="720" w:hanging="360"/>
+      </w:pPr>
+      <w:rPr>
+        <w:rFonts w:ascii="Symbol" w:hAnsi="Symbol" w:hint="default"/>
+        <w:sz w:val="20"/>
+      </w:rPr>
+    </w:lvl>
+    <w:lvl w:ilvl="1" w:tentative="1">
+      <w:start w:val="1"/>
+      <w:numFmt w:val="bullet"/>
+      <w:lvlText w:val="o"/>
+      <w:lvlJc w:val="left"/>
+      <w:pPr>
+        <w:tabs>
+          <w:tab w:val="num" w:pos="1440"/>
+        </w:tabs>
+        <w:ind w:left="1440" w:hanging="360"/>
+      </w:pPr>
+      <w:rPr>
+        <w:rFonts w:ascii="Courier New" w:hAnsi="Courier New" w:hint="default"/>
+        <w:sz w:val="20"/>
+      </w:rPr>
+    </w:lvl>
+    <w:lvl w:ilvl="2" w:tentative="1">
+      <w:start w:val="1"/>
+      <w:numFmt w:val="bullet"/>
+      <w:lvlText w:val=""/>
+      <w:lvlJc w:val="left"/>
+      <w:pPr>
+        <w:tabs>
+          <w:tab w:val="num" w:pos="2160"/>
+        </w:tabs>
+        <w:ind w:left="2160" w:hanging="360"/>
+      </w:pPr>
+      <w:rPr>
+        <w:rFonts w:ascii="Wingdings" w:hAnsi="Wingdings" w:hint="default"/>
+        <w:sz w:val="20"/>
+      </w:rPr>
+    </w:lvl>
+    <w:lvl w:ilvl="3" w:tentative="1">
+      <w:start w:val="1"/>
+      <w:numFmt w:val="bullet"/>
+      <w:lvlText w:val=""/>
+      <w:lvlJc w:val="left"/>
+      <w:pPr>
+        <w:tabs>
+          <w:tab w:val="num" w:pos="2880"/>
+        </w:tabs>
+        <w:ind w:left="2880" w:hanging="360"/>
+      </w:pPr>
+      <w:rPr>
+        <w:rFonts w:ascii="Wingdings" w:hAnsi="Wingdings" w:hint="default"/>
+        <w:sz w:val="20"/>
+      </w:rPr>
+    </w:lvl>
+    <w:lvl w:ilvl="4" w:tentative="1">
+      <w:start w:val="1"/>
+      <w:numFmt w:val="bullet"/>
+      <w:lvlText w:val=""/>
+      <w:lvlJc w:val="left"/>
+      <w:pPr>
+        <w:tabs>
+          <w:tab w:val="num" w:pos="3600"/>
+        </w:tabs>
+        <w:ind w:left="3600" w:hanging="360"/>
+      </w:pPr>
+      <w:rPr>
+        <w:rFonts w:ascii="Wingdings" w:hAnsi="Wingdings" w:hint="default"/>
+        <w:sz w:val="20"/>
+      </w:rPr>
+    </w:lvl>
+    <w:lvl w:ilvl="5" w:tentative="1">
+      <w:start w:val="1"/>
+      <w:numFmt w:val="bullet"/>
+      <w:lvlText w:val=""/>
+      <w:lvlJc w:val="left"/>
+      <w:pPr>
+        <w:tabs>
+          <w:tab w:val="num" w:pos="4320"/>
+        </w:tabs>
+        <w:ind w:left="4320" w:hanging="360"/>
+      </w:pPr>
+      <w:rPr>
+        <w:rFonts w:ascii="Wingdings" w:hAnsi="Wingdings" w:hint="default"/>
+        <w:sz w:val="20"/>
+      </w:rPr>
+    </w:lvl>
+    <w:lvl w:ilvl="6" w:tentative="1">
+      <w:start w:val="1"/>
+      <w:numFmt w:val="bullet"/>
+      <w:lvlText w:val=""/>
+      <w:lvlJc w:val="left"/>
+      <w:pPr>
+        <w:tabs>
+          <w:tab w:val="num" w:pos="5040"/>
+        </w:tabs>
+        <w:ind w:left="5040" w:hanging="360"/>
+      </w:pPr>
+      <w:rPr>
+        <w:rFonts w:ascii="Wingdings" w:hAnsi="Wingdings" w:hint="default"/>
+        <w:sz w:val="20"/>
+      </w:rPr>
+    </w:lvl>
+    <w:lvl w:ilvl="7" w:tentative="1">
+      <w:start w:val="1"/>
+      <w:numFmt w:val="bullet"/>
+      <w:lvlText w:val=""/>
+      <w:lvlJc w:val="left"/>
+      <w:pPr>
+        <w:tabs>
+          <w:tab w:val="num" w:pos="5760"/>
+        </w:tabs>
+        <w:ind w:left="5760" w:hanging="360"/>
+      </w:pPr>
+      <w:rPr>
+        <w:rFonts w:ascii="Wingdings" w:hAnsi="Wingdings" w:hint="default"/>
+        <w:sz w:val="20"/>
+      </w:rPr>
+    </w:lvl>
+    <w:lvl w:ilvl="8" w:tentative="1">
+      <w:start w:val="1"/>
+      <w:numFmt w:val="bullet"/>
+      <w:lvlText w:val=""/>
+      <w:lvlJc w:val="left"/>
+      <w:pPr>
+        <w:tabs>
+          <w:tab w:val="num" w:pos="6480"/>
+        </w:tabs>
+        <w:ind w:left="6480" w:hanging="360"/>
+      </w:pPr>
+      <w:rPr>
+        <w:rFonts w:ascii="Wingdings" w:hAnsi="Wingdings" w:hint="default"/>
+        <w:sz w:val="20"/>
+      </w:rPr>
+    </w:lvl>
+  </w:abstractNum>
+  <w:abstractNum w:abstractNumId="13" w15:restartNumberingAfterBreak="0">
+    <w:nsid w:val="7A876372"/>
+    <w:multiLevelType w:val="hybridMultilevel"/>
+    <w:tmpl w:val="9DEC0B28"/>
+    <w:lvl w:ilvl="0" w:tplc="3ABA64EA">
+      <w:start w:val="1"/>
+      <w:numFmt w:val="bullet"/>
+      <w:lvlText w:val=""/>
+      <w:lvlJc w:val="left"/>
+      <w:pPr>
+        <w:tabs>
+          <w:tab w:val="num" w:pos="720"/>
+        </w:tabs>
+        <w:ind w:left="720" w:hanging="360"/>
+      </w:pPr>
+      <w:rPr>
+        <w:rFonts w:ascii="Symbol" w:hAnsi="Symbol" w:hint="default"/>
+        <w:sz w:val="20"/>
+      </w:rPr>
+    </w:lvl>
+    <w:lvl w:ilvl="1" w:tplc="FD6810E4">
+      <w:start w:val="1"/>
+      <w:numFmt w:val="decimal"/>
+      <w:lvlText w:val="%2."/>
+      <w:lvlJc w:val="left"/>
+      <w:pPr>
+        <w:tabs>
+          <w:tab w:val="num" w:pos="1440"/>
+        </w:tabs>
+        <w:ind w:left="1440" w:hanging="360"/>
+      </w:pPr>
+    </w:lvl>
+    <w:lvl w:ilvl="2" w:tplc="364C89DA" w:tentative="1">
+      <w:start w:val="1"/>
+      <w:numFmt w:val="bullet"/>
+      <w:lvlText w:val=""/>
+      <w:lvlJc w:val="left"/>
+      <w:pPr>
+        <w:tabs>
+          <w:tab w:val="num" w:pos="2160"/>
+        </w:tabs>
+        <w:ind w:left="2160" w:hanging="360"/>
+      </w:pPr>
+      <w:rPr>
+        <w:rFonts w:ascii="Wingdings" w:hAnsi="Wingdings" w:hint="default"/>
+        <w:sz w:val="20"/>
+      </w:rPr>
+    </w:lvl>
+    <w:lvl w:ilvl="3" w:tplc="19D8F81A" w:tentative="1">
+      <w:start w:val="1"/>
+      <w:numFmt w:val="bullet"/>
+      <w:lvlText w:val=""/>
+      <w:lvlJc w:val="left"/>
+      <w:pPr>
+        <w:tabs>
+          <w:tab w:val="num" w:pos="2880"/>
+        </w:tabs>
+        <w:ind w:left="2880" w:hanging="360"/>
+      </w:pPr>
+      <w:rPr>
+        <w:rFonts w:ascii="Wingdings" w:hAnsi="Wingdings" w:hint="default"/>
+        <w:sz w:val="20"/>
+      </w:rPr>
+    </w:lvl>
+    <w:lvl w:ilvl="4" w:tplc="B03EBBA2" w:tentative="1">
+      <w:start w:val="1"/>
+      <w:numFmt w:val="bullet"/>
+      <w:lvlText w:val=""/>
+      <w:lvlJc w:val="left"/>
+      <w:pPr>
+        <w:tabs>
+          <w:tab w:val="num" w:pos="3600"/>
+        </w:tabs>
+        <w:ind w:left="3600" w:hanging="360"/>
+      </w:pPr>
+      <w:rPr>
+        <w:rFonts w:ascii="Wingdings" w:hAnsi="Wingdings" w:hint="default"/>
+        <w:sz w:val="20"/>
+      </w:rPr>
+    </w:lvl>
+    <w:lvl w:ilvl="5" w:tplc="D0CA836C" w:tentative="1">
+      <w:start w:val="1"/>
+      <w:numFmt w:val="bullet"/>
+      <w:lvlText w:val=""/>
+      <w:lvlJc w:val="left"/>
+      <w:pPr>
+        <w:tabs>
+          <w:tab w:val="num" w:pos="4320"/>
+        </w:tabs>
+        <w:ind w:left="4320" w:hanging="360"/>
+      </w:pPr>
+      <w:rPr>
+        <w:rFonts w:ascii="Wingdings" w:hAnsi="Wingdings" w:hint="default"/>
+        <w:sz w:val="20"/>
+      </w:rPr>
+    </w:lvl>
+    <w:lvl w:ilvl="6" w:tplc="2BC44C88" w:tentative="1">
+      <w:start w:val="1"/>
+      <w:numFmt w:val="bullet"/>
+      <w:lvlText w:val=""/>
+      <w:lvlJc w:val="left"/>
+      <w:pPr>
+        <w:tabs>
+          <w:tab w:val="num" w:pos="5040"/>
+        </w:tabs>
+        <w:ind w:left="5040" w:hanging="360"/>
+      </w:pPr>
+      <w:rPr>
+        <w:rFonts w:ascii="Wingdings" w:hAnsi="Wingdings" w:hint="default"/>
+        <w:sz w:val="20"/>
+      </w:rPr>
+    </w:lvl>
+    <w:lvl w:ilvl="7" w:tplc="5422FDFA" w:tentative="1">
+      <w:start w:val="1"/>
+      <w:numFmt w:val="bullet"/>
+      <w:lvlText w:val=""/>
+      <w:lvlJc w:val="left"/>
+      <w:pPr>
+        <w:tabs>
+          <w:tab w:val="num" w:pos="5760"/>
+        </w:tabs>
+        <w:ind w:left="5760" w:hanging="360"/>
+      </w:pPr>
+      <w:rPr>
+        <w:rFonts w:ascii="Wingdings" w:hAnsi="Wingdings" w:hint="default"/>
+        <w:sz w:val="20"/>
+      </w:rPr>
+    </w:lvl>
+    <w:lvl w:ilvl="8" w:tplc="092C264A" w:tentative="1">
+      <w:start w:val="1"/>
+      <w:numFmt w:val="bullet"/>
+      <w:lvlText w:val=""/>
+      <w:lvlJc w:val="left"/>
+      <w:pPr>
+        <w:tabs>
+          <w:tab w:val="num" w:pos="6480"/>
+        </w:tabs>
+        <w:ind w:left="6480" w:hanging="360"/>
+      </w:pPr>
+      <w:rPr>
+        <w:rFonts w:ascii="Wingdings" w:hAnsi="Wingdings" w:hint="default"/>
+        <w:sz w:val="20"/>
+      </w:rPr>
+    </w:lvl>
+  </w:abstractNum>
   <w:num w:numId="1" w16cid:durableId="983047340">
+    <w:abstractNumId w:val="11"/>
+  </w:num>
+  <w:num w:numId="2" w16cid:durableId="1676417257">
+    <w:abstractNumId w:val="6"/>
+  </w:num>
+  <w:num w:numId="3" w16cid:durableId="217977534">
+    <w:abstractNumId w:val="10"/>
+  </w:num>
+  <w:num w:numId="4" w16cid:durableId="1883706180">
     <w:abstractNumId w:val="5"/>
   </w:num>
-  <w:num w:numId="2" w16cid:durableId="1676417257">
+  <w:num w:numId="5" w16cid:durableId="1289051561">
     <w:abstractNumId w:val="2"/>
   </w:num>
-  <w:num w:numId="3" w16cid:durableId="217977534">
+  <w:num w:numId="6" w16cid:durableId="1286429098">
+    <w:abstractNumId w:val="8"/>
+  </w:num>
+  <w:num w:numId="7" w16cid:durableId="835609178">
+    <w:abstractNumId w:val="3"/>
+  </w:num>
+  <w:num w:numId="8" w16cid:durableId="684287623">
+    <w:abstractNumId w:val="9"/>
+  </w:num>
+  <w:num w:numId="9" w16cid:durableId="165024217">
+    <w:abstractNumId w:val="0"/>
+  </w:num>
+  <w:num w:numId="10" w16cid:durableId="1881279251">
+    <w:abstractNumId w:val="12"/>
+  </w:num>
+  <w:num w:numId="11" w16cid:durableId="587158263">
     <w:abstractNumId w:val="4"/>
   </w:num>
-  <w:num w:numId="4" w16cid:durableId="1883706180">
+  <w:num w:numId="12" w16cid:durableId="1208831257">
     <w:abstractNumId w:val="1"/>
   </w:num>
-  <w:num w:numId="5" w16cid:durableId="1289051561">
-    <w:abstractNumId w:val="0"/>
+  <w:num w:numId="13" w16cid:durableId="659425239">
+    <w:abstractNumId w:val="13"/>
   </w:num>
-  <w:num w:numId="6" w16cid:durableId="1286429098">
-    <w:abstractNumId w:val="3"/>
+  <w:num w:numId="14" w16cid:durableId="1081412405">
+    <w:abstractNumId w:val="7"/>
   </w:num>
 </w:numbering>
 </file>

</xml_diff>